<commit_message>
redesign notes in DSH
</commit_message>
<xml_diff>
--- a/DSH/notes/Unit-2.docx
+++ b/DSH/notes/Unit-2.docx
@@ -65,7 +65,7 @@
     <w:p>
       <w:r>
         <w:pict w14:anchorId="0D91A631">
-          <v:rect id="_x0000_i2057" style="width:0;height:1.5pt" o:hralign="center" o:hrstd="t" o:hr="t" fillcolor="#a0a0a0" stroked="f"/>
+          <v:rect id="_x0000_i1025" style="width:0;height:1.5pt" o:hralign="center" o:hrstd="t" o:hr="t" fillcolor="#a0a0a0" stroked="f"/>
         </w:pict>
       </w:r>
     </w:p>
@@ -81,23 +81,7 @@
           <w:b/>
           <w:bCs/>
         </w:rPr>
-        <w:t xml:space="preserve">1. What </w:t>
-      </w:r>
-      <w:proofErr w:type="gramStart"/>
-      <w:r>
-        <w:rPr>
-          <w:b/>
-          <w:bCs/>
-        </w:rPr>
-        <w:t>is</w:t>
-      </w:r>
-      <w:proofErr w:type="gramEnd"/>
-      <w:r>
-        <w:rPr>
-          <w:b/>
-          <w:bCs/>
-        </w:rPr>
-        <w:t xml:space="preserve"> Descriptive Analytics</w:t>
+        <w:t>1. What is Descriptive Analytics</w:t>
       </w:r>
     </w:p>
     <w:p>
@@ -201,7 +185,7 @@
     <w:p>
       <w:r>
         <w:pict w14:anchorId="27A16A83">
-          <v:rect id="_x0000_i2058" style="width:0;height:1.5pt" o:hralign="center" o:hrstd="t" o:hr="t" fillcolor="#a0a0a0" stroked="f"/>
+          <v:rect id="_x0000_i1026" style="width:0;height:1.5pt" o:hralign="center" o:hrstd="t" o:hr="t" fillcolor="#a0a0a0" stroked="f"/>
         </w:pict>
       </w:r>
     </w:p>
@@ -428,7 +412,7 @@
     <w:p>
       <w:r>
         <w:pict w14:anchorId="767FECB8">
-          <v:rect id="_x0000_i2059" style="width:0;height:1.5pt" o:hralign="center" o:hrstd="t" o:hr="t" fillcolor="#a0a0a0" stroked="f"/>
+          <v:rect id="_x0000_i1027" style="width:0;height:1.5pt" o:hralign="center" o:hrstd="t" o:hr="t" fillcolor="#a0a0a0" stroked="f"/>
         </w:pict>
       </w:r>
     </w:p>
@@ -680,7 +664,7 @@
     <w:p>
       <w:r>
         <w:pict w14:anchorId="24A93379">
-          <v:rect id="_x0000_i2060" style="width:0;height:1.5pt" o:hralign="center" o:hrstd="t" o:hr="t" fillcolor="#a0a0a0" stroked="f"/>
+          <v:rect id="_x0000_i1028" style="width:0;height:1.5pt" o:hralign="center" o:hrstd="t" o:hr="t" fillcolor="#a0a0a0" stroked="f"/>
         </w:pict>
       </w:r>
     </w:p>
@@ -902,7 +886,7 @@
     <w:p>
       <w:r>
         <w:pict w14:anchorId="0A2880B4">
-          <v:rect id="_x0000_i2061" style="width:0;height:1.5pt" o:hralign="center" o:hrstd="t" o:hr="t" fillcolor="#a0a0a0" stroked="f"/>
+          <v:rect id="_x0000_i1029" style="width:0;height:1.5pt" o:hralign="center" o:hrstd="t" o:hr="t" fillcolor="#a0a0a0" stroked="f"/>
         </w:pict>
       </w:r>
     </w:p>
@@ -1181,7 +1165,7 @@
     <w:p>
       <w:r>
         <w:pict w14:anchorId="4EDE2167">
-          <v:rect id="_x0000_i2062" style="width:0;height:1.5pt" o:hralign="center" o:hrstd="t" o:hr="t" fillcolor="#a0a0a0" stroked="f"/>
+          <v:rect id="_x0000_i1030" style="width:0;height:1.5pt" o:hralign="center" o:hrstd="t" o:hr="t" fillcolor="#a0a0a0" stroked="f"/>
         </w:pict>
       </w:r>
     </w:p>
@@ -1414,7 +1398,7 @@
     <w:p>
       <w:r>
         <w:pict w14:anchorId="3AB4461C">
-          <v:rect id="_x0000_i2063" style="width:0;height:1.5pt" o:hralign="center" o:hrstd="t" o:hr="t" fillcolor="#a0a0a0" stroked="f"/>
+          <v:rect id="_x0000_i1031" style="width:0;height:1.5pt" o:hralign="center" o:hrstd="t" o:hr="t" fillcolor="#a0a0a0" stroked="f"/>
         </w:pict>
       </w:r>
     </w:p>
@@ -1493,7 +1477,7 @@
     <w:p>
       <w:r>
         <w:pict w14:anchorId="30F263E9">
-          <v:rect id="_x0000_i2064" style="width:0;height:1.5pt" o:hralign="center" o:hrstd="t" o:hr="t" fillcolor="#a0a0a0" stroked="f"/>
+          <v:rect id="_x0000_i1032" style="width:0;height:1.5pt" o:hralign="center" o:hrstd="t" o:hr="t" fillcolor="#a0a0a0" stroked="f"/>
         </w:pict>
       </w:r>
     </w:p>
@@ -1735,7 +1719,7 @@
     <w:p>
       <w:r>
         <w:pict w14:anchorId="5DEF9CE9">
-          <v:rect id="_x0000_i2065" style="width:0;height:1.5pt" o:hralign="center" o:hrstd="t" o:hr="t" fillcolor="#a0a0a0" stroked="f"/>
+          <v:rect id="_x0000_i1033" style="width:0;height:1.5pt" o:hralign="center" o:hrstd="t" o:hr="t" fillcolor="#a0a0a0" stroked="f"/>
         </w:pict>
       </w:r>
     </w:p>
@@ -1949,7 +1933,7 @@
     <w:p>
       <w:r>
         <w:pict w14:anchorId="4C638A7C">
-          <v:rect id="_x0000_i2066" style="width:0;height:1.5pt" o:hralign="center" o:hrstd="t" o:hr="t" fillcolor="#a0a0a0" stroked="f"/>
+          <v:rect id="_x0000_i1034" style="width:0;height:1.5pt" o:hralign="center" o:hrstd="t" o:hr="t" fillcolor="#a0a0a0" stroked="f"/>
         </w:pict>
       </w:r>
     </w:p>
@@ -2119,7 +2103,7 @@
     <w:p>
       <w:r>
         <w:pict w14:anchorId="21C489D8">
-          <v:rect id="_x0000_i2067" style="width:0;height:1.5pt" o:hralign="center" o:hrstd="t" o:hr="t" fillcolor="#a0a0a0" stroked="f"/>
+          <v:rect id="_x0000_i1035" style="width:0;height:1.5pt" o:hralign="center" o:hrstd="t" o:hr="t" fillcolor="#a0a0a0" stroked="f"/>
         </w:pict>
       </w:r>
     </w:p>
@@ -2294,7 +2278,7 @@
     <w:p>
       <w:r>
         <w:pict w14:anchorId="0BE8F24C">
-          <v:rect id="_x0000_i2068" style="width:0;height:1.5pt" o:hralign="center" o:hrstd="t" o:hr="t" fillcolor="#a0a0a0" stroked="f"/>
+          <v:rect id="_x0000_i1036" style="width:0;height:1.5pt" o:hralign="center" o:hrstd="t" o:hr="t" fillcolor="#a0a0a0" stroked="f"/>
         </w:pict>
       </w:r>
     </w:p>
@@ -2532,7 +2516,7 @@
       <w:r>
         <w:lastRenderedPageBreak/>
         <w:pict w14:anchorId="02A40463">
-          <v:rect id="_x0000_i2069" style="width:0;height:1.5pt" o:hralign="center" o:hrstd="t" o:hr="t" fillcolor="#a0a0a0" stroked="f"/>
+          <v:rect id="_x0000_i1037" style="width:0;height:1.5pt" o:hralign="center" o:hrstd="t" o:hr="t" fillcolor="#a0a0a0" stroked="f"/>
         </w:pict>
       </w:r>
     </w:p>
@@ -2739,7 +2723,7 @@
     <w:p>
       <w:r>
         <w:pict w14:anchorId="6948F4F9">
-          <v:rect id="_x0000_i2070" style="width:0;height:1.5pt" o:hralign="center" o:hrstd="t" o:hr="t" fillcolor="#a0a0a0" stroked="f"/>
+          <v:rect id="_x0000_i1038" style="width:0;height:1.5pt" o:hralign="center" o:hrstd="t" o:hr="t" fillcolor="#a0a0a0" stroked="f"/>
         </w:pict>
       </w:r>
     </w:p>
@@ -2791,7 +2775,7 @@
     <w:p>
       <w:r>
         <w:pict w14:anchorId="2EEAD857">
-          <v:rect id="_x0000_i2071" style="width:0;height:1.5pt" o:hralign="center" o:hrstd="t" o:hr="t" fillcolor="#a0a0a0" stroked="f"/>
+          <v:rect id="_x0000_i1039" style="width:0;height:1.5pt" o:hralign="center" o:hrstd="t" o:hr="t" fillcolor="#a0a0a0" stroked="f"/>
         </w:pict>
       </w:r>
     </w:p>
@@ -2846,7 +2830,7 @@
     <w:p>
       <w:r>
         <w:pict w14:anchorId="027A50F5">
-          <v:rect id="_x0000_i2072" style="width:0;height:1.5pt" o:hralign="center" o:hrstd="t" o:hr="t" fillcolor="#a0a0a0" stroked="f"/>
+          <v:rect id="_x0000_i1040" style="width:0;height:1.5pt" o:hralign="center" o:hrstd="t" o:hr="t" fillcolor="#a0a0a0" stroked="f"/>
         </w:pict>
       </w:r>
     </w:p>
@@ -3025,7 +3009,7 @@
     <w:p>
       <w:r>
         <w:pict w14:anchorId="29808831">
-          <v:rect id="_x0000_i2073" style="width:0;height:1.5pt" o:hralign="center" o:hrstd="t" o:hr="t" fillcolor="#a0a0a0" stroked="f"/>
+          <v:rect id="_x0000_i1041" style="width:0;height:1.5pt" o:hralign="center" o:hrstd="t" o:hr="t" fillcolor="#a0a0a0" stroked="f"/>
         </w:pict>
       </w:r>
     </w:p>
@@ -3091,7 +3075,7 @@
     <w:p>
       <w:r>
         <w:pict w14:anchorId="42F59AB1">
-          <v:rect id="_x0000_i2074" style="width:0;height:1.5pt" o:hralign="center" o:hrstd="t" o:hr="t" fillcolor="#a0a0a0" stroked="f"/>
+          <v:rect id="_x0000_i1042" style="width:0;height:1.5pt" o:hralign="center" o:hrstd="t" o:hr="t" fillcolor="#a0a0a0" stroked="f"/>
         </w:pict>
       </w:r>
     </w:p>
@@ -3311,7 +3295,7 @@
     <w:p>
       <w:r>
         <w:pict w14:anchorId="633C4F71">
-          <v:rect id="_x0000_i2075" style="width:0;height:1.5pt" o:hralign="center" o:hrstd="t" o:hr="t" fillcolor="#a0a0a0" stroked="f"/>
+          <v:rect id="_x0000_i1043" style="width:0;height:1.5pt" o:hralign="center" o:hrstd="t" o:hr="t" fillcolor="#a0a0a0" stroked="f"/>
         </w:pict>
       </w:r>
     </w:p>
@@ -3644,7 +3628,7 @@
     <w:p>
       <w:r>
         <w:pict w14:anchorId="1BC08569">
-          <v:rect id="_x0000_i2076" style="width:0;height:1.5pt" o:hralign="center" o:hrstd="t" o:hr="t" fillcolor="#a0a0a0" stroked="f"/>
+          <v:rect id="_x0000_i1044" style="width:0;height:1.5pt" o:hralign="center" o:hrstd="t" o:hr="t" fillcolor="#a0a0a0" stroked="f"/>
         </w:pict>
       </w:r>
     </w:p>
@@ -3921,7 +3905,7 @@
     <w:p>
       <w:r>
         <w:pict w14:anchorId="43CABB13">
-          <v:rect id="_x0000_i2077" style="width:0;height:1.5pt" o:hralign="center" o:hrstd="t" o:hr="t" fillcolor="#a0a0a0" stroked="f"/>
+          <v:rect id="_x0000_i1045" style="width:0;height:1.5pt" o:hralign="center" o:hrstd="t" o:hr="t" fillcolor="#a0a0a0" stroked="f"/>
         </w:pict>
       </w:r>
     </w:p>
@@ -4048,7 +4032,7 @@
     <w:p>
       <w:r>
         <w:pict w14:anchorId="5377AF01">
-          <v:rect id="_x0000_i2078" style="width:0;height:1.5pt" o:hralign="center" o:hrstd="t" o:hr="t" fillcolor="#a0a0a0" stroked="f"/>
+          <v:rect id="_x0000_i1046" style="width:0;height:1.5pt" o:hralign="center" o:hrstd="t" o:hr="t" fillcolor="#a0a0a0" stroked="f"/>
         </w:pict>
       </w:r>
     </w:p>
@@ -4188,7 +4172,7 @@
     <w:p>
       <w:r>
         <w:pict w14:anchorId="318190CE">
-          <v:rect id="_x0000_i2079" style="width:0;height:1.5pt" o:hralign="center" o:hrstd="t" o:hr="t" fillcolor="#a0a0a0" stroked="f"/>
+          <v:rect id="_x0000_i1047" style="width:0;height:1.5pt" o:hralign="center" o:hrstd="t" o:hr="t" fillcolor="#a0a0a0" stroked="f"/>
         </w:pict>
       </w:r>
     </w:p>
@@ -4413,7 +4397,7 @@
     <w:p>
       <w:r>
         <w:pict w14:anchorId="529D07B3">
-          <v:rect id="_x0000_i2080" style="width:0;height:1.5pt" o:hralign="center" o:hrstd="t" o:hr="t" fillcolor="#a0a0a0" stroked="f"/>
+          <v:rect id="_x0000_i1048" style="width:0;height:1.5pt" o:hralign="center" o:hrstd="t" o:hr="t" fillcolor="#a0a0a0" stroked="f"/>
         </w:pict>
       </w:r>
     </w:p>
@@ -4624,7 +4608,7 @@
     <w:p>
       <w:r>
         <w:pict w14:anchorId="6D3D4833">
-          <v:rect id="_x0000_i2081" style="width:0;height:1.5pt" o:hralign="center" o:hrstd="t" o:hr="t" fillcolor="#a0a0a0" stroked="f"/>
+          <v:rect id="_x0000_i1049" style="width:0;height:1.5pt" o:hralign="center" o:hrstd="t" o:hr="t" fillcolor="#a0a0a0" stroked="f"/>
         </w:pict>
       </w:r>
     </w:p>
@@ -4902,7 +4886,7 @@
     <w:p>
       <w:r>
         <w:pict w14:anchorId="6307B520">
-          <v:rect id="_x0000_i2082" style="width:0;height:1.5pt" o:hralign="center" o:hrstd="t" o:hr="t" fillcolor="#a0a0a0" stroked="f"/>
+          <v:rect id="_x0000_i1050" style="width:0;height:1.5pt" o:hralign="center" o:hrstd="t" o:hr="t" fillcolor="#a0a0a0" stroked="f"/>
         </w:pict>
       </w:r>
     </w:p>
@@ -4962,7 +4946,7 @@
     <w:p>
       <w:r>
         <w:pict w14:anchorId="39BC7C58">
-          <v:rect id="_x0000_i2083" style="width:0;height:1.5pt" o:hralign="center" o:hrstd="t" o:hr="t" fillcolor="#a0a0a0" stroked="f"/>
+          <v:rect id="_x0000_i1051" style="width:0;height:1.5pt" o:hralign="center" o:hrstd="t" o:hr="t" fillcolor="#a0a0a0" stroked="f"/>
         </w:pict>
       </w:r>
     </w:p>
@@ -5179,7 +5163,7 @@
     <w:p>
       <w:r>
         <w:pict w14:anchorId="0EFB0F24">
-          <v:rect id="_x0000_i2084" style="width:0;height:1.5pt" o:hralign="center" o:hrstd="t" o:hr="t" fillcolor="#a0a0a0" stroked="f"/>
+          <v:rect id="_x0000_i1052" style="width:0;height:1.5pt" o:hralign="center" o:hrstd="t" o:hr="t" fillcolor="#a0a0a0" stroked="f"/>
         </w:pict>
       </w:r>
     </w:p>
@@ -5565,7 +5549,7 @@
     <w:p>
       <w:r>
         <w:pict w14:anchorId="5080A361">
-          <v:rect id="_x0000_i2085" style="width:0;height:1.5pt" o:hralign="center" o:hrstd="t" o:hr="t" fillcolor="#a0a0a0" stroked="f"/>
+          <v:rect id="_x0000_i1053" style="width:0;height:1.5pt" o:hralign="center" o:hrstd="t" o:hr="t" fillcolor="#a0a0a0" stroked="f"/>
         </w:pict>
       </w:r>
     </w:p>
@@ -5646,7 +5630,7 @@
     <w:p>
       <w:r>
         <w:pict w14:anchorId="7208AF21">
-          <v:rect id="_x0000_i2086" style="width:0;height:1.5pt" o:hralign="center" o:hrstd="t" o:hr="t" fillcolor="#a0a0a0" stroked="f"/>
+          <v:rect id="_x0000_i1054" style="width:0;height:1.5pt" o:hralign="center" o:hrstd="t" o:hr="t" fillcolor="#a0a0a0" stroked="f"/>
         </w:pict>
       </w:r>
     </w:p>
@@ -5848,7 +5832,7 @@
     <w:p>
       <w:r>
         <w:pict w14:anchorId="52337E99">
-          <v:rect id="_x0000_i2087" style="width:0;height:1.5pt" o:hralign="center" o:hrstd="t" o:hr="t" fillcolor="#a0a0a0" stroked="f"/>
+          <v:rect id="_x0000_i1055" style="width:0;height:1.5pt" o:hralign="center" o:hrstd="t" o:hr="t" fillcolor="#a0a0a0" stroked="f"/>
         </w:pict>
       </w:r>
     </w:p>
@@ -6038,7 +6022,7 @@
     <w:p>
       <w:r>
         <w:pict w14:anchorId="1C8C85EE">
-          <v:rect id="_x0000_i2088" style="width:0;height:1.5pt" o:hralign="center" o:hrstd="t" o:hr="t" fillcolor="#a0a0a0" stroked="f"/>
+          <v:rect id="_x0000_i1056" style="width:0;height:1.5pt" o:hralign="center" o:hrstd="t" o:hr="t" fillcolor="#a0a0a0" stroked="f"/>
         </w:pict>
       </w:r>
     </w:p>
@@ -6223,7 +6207,7 @@
     <w:p>
       <w:r>
         <w:pict w14:anchorId="55FAC6D6">
-          <v:rect id="_x0000_i2089" style="width:0;height:1.5pt" o:hralign="center" o:hrstd="t" o:hr="t" fillcolor="#a0a0a0" stroked="f"/>
+          <v:rect id="_x0000_i1057" style="width:0;height:1.5pt" o:hralign="center" o:hrstd="t" o:hr="t" fillcolor="#a0a0a0" stroked="f"/>
         </w:pict>
       </w:r>
     </w:p>
@@ -6299,7 +6283,7 @@
     <w:p>
       <w:r>
         <w:pict w14:anchorId="10AAF59C">
-          <v:rect id="_x0000_i2090" style="width:0;height:1.5pt" o:hralign="center" o:hrstd="t" o:hr="t" fillcolor="#a0a0a0" stroked="f"/>
+          <v:rect id="_x0000_i1058" style="width:0;height:1.5pt" o:hralign="center" o:hrstd="t" o:hr="t" fillcolor="#a0a0a0" stroked="f"/>
         </w:pict>
       </w:r>
     </w:p>
@@ -6469,7 +6453,7 @@
     <w:p>
       <w:r>
         <w:pict w14:anchorId="099D0A70">
-          <v:rect id="_x0000_i2091" style="width:0;height:1.5pt" o:hralign="center" o:hrstd="t" o:hr="t" fillcolor="#a0a0a0" stroked="f"/>
+          <v:rect id="_x0000_i1059" style="width:0;height:1.5pt" o:hralign="center" o:hrstd="t" o:hr="t" fillcolor="#a0a0a0" stroked="f"/>
         </w:pict>
       </w:r>
     </w:p>
@@ -6840,7 +6824,7 @@
       <w:r>
         <w:lastRenderedPageBreak/>
         <w:pict w14:anchorId="68A616F8">
-          <v:rect id="_x0000_i2092" style="width:0;height:1.5pt" o:hralign="center" o:hrstd="t" o:hr="t" fillcolor="#a0a0a0" stroked="f"/>
+          <v:rect id="_x0000_i1060" style="width:0;height:1.5pt" o:hralign="center" o:hrstd="t" o:hr="t" fillcolor="#a0a0a0" stroked="f"/>
         </w:pict>
       </w:r>
     </w:p>
@@ -7057,7 +7041,7 @@
     <w:p>
       <w:r>
         <w:pict w14:anchorId="46CC0F58">
-          <v:rect id="_x0000_i2093" style="width:0;height:1.5pt" o:hralign="center" o:hrstd="t" o:hr="t" fillcolor="#a0a0a0" stroked="f"/>
+          <v:rect id="_x0000_i1061" style="width:0;height:1.5pt" o:hralign="center" o:hrstd="t" o:hr="t" fillcolor="#a0a0a0" stroked="f"/>
         </w:pict>
       </w:r>
     </w:p>
@@ -7123,7 +7107,7 @@
     <w:p>
       <w:r>
         <w:pict w14:anchorId="1D758859">
-          <v:rect id="_x0000_i2094" style="width:0;height:1.5pt" o:hralign="center" o:hrstd="t" o:hr="t" fillcolor="#a0a0a0" stroked="f"/>
+          <v:rect id="_x0000_i1062" style="width:0;height:1.5pt" o:hralign="center" o:hrstd="t" o:hr="t" fillcolor="#a0a0a0" stroked="f"/>
         </w:pict>
       </w:r>
     </w:p>
@@ -7293,7 +7277,7 @@
     <w:p>
       <w:r>
         <w:pict w14:anchorId="40FC8EF5">
-          <v:rect id="_x0000_i2095" style="width:0;height:1.5pt" o:hralign="center" o:hrstd="t" o:hr="t" fillcolor="#a0a0a0" stroked="f"/>
+          <v:rect id="_x0000_i1063" style="width:0;height:1.5pt" o:hralign="center" o:hrstd="t" o:hr="t" fillcolor="#a0a0a0" stroked="f"/>
         </w:pict>
       </w:r>
     </w:p>
@@ -7685,7 +7669,7 @@
     <w:p>
       <w:r>
         <w:pict w14:anchorId="417FA2DF">
-          <v:rect id="_x0000_i2097" style="width:0;height:1.5pt" o:hralign="center" o:hrstd="t" o:hr="t" fillcolor="#a0a0a0" stroked="f"/>
+          <v:rect id="_x0000_i1064" style="width:0;height:1.5pt" o:hralign="center" o:hrstd="t" o:hr="t" fillcolor="#a0a0a0" stroked="f"/>
         </w:pict>
       </w:r>
     </w:p>
@@ -7760,7 +7744,7 @@
     <w:p>
       <w:r>
         <w:pict w14:anchorId="58980B85">
-          <v:rect id="_x0000_i2098" style="width:0;height:1.5pt" o:hralign="center" o:hrstd="t" o:hr="t" fillcolor="#a0a0a0" stroked="f"/>
+          <v:rect id="_x0000_i1065" style="width:0;height:1.5pt" o:hralign="center" o:hrstd="t" o:hr="t" fillcolor="#a0a0a0" stroked="f"/>
         </w:pict>
       </w:r>
     </w:p>
@@ -7826,7 +7810,7 @@
     <w:p>
       <w:r>
         <w:pict w14:anchorId="5BFEC43B">
-          <v:rect id="_x0000_i2099" style="width:0;height:1.5pt" o:hralign="center" o:hrstd="t" o:hr="t" fillcolor="#a0a0a0" stroked="f"/>
+          <v:rect id="_x0000_i1066" style="width:0;height:1.5pt" o:hralign="center" o:hrstd="t" o:hr="t" fillcolor="#a0a0a0" stroked="f"/>
         </w:pict>
       </w:r>
     </w:p>
@@ -7996,7 +7980,7 @@
     <w:p>
       <w:r>
         <w:pict w14:anchorId="57BB003F">
-          <v:rect id="_x0000_i2100" style="width:0;height:1.5pt" o:hralign="center" o:hrstd="t" o:hr="t" fillcolor="#a0a0a0" stroked="f"/>
+          <v:rect id="_x0000_i1067" style="width:0;height:1.5pt" o:hralign="center" o:hrstd="t" o:hr="t" fillcolor="#a0a0a0" stroked="f"/>
         </w:pict>
       </w:r>
     </w:p>
@@ -8335,7 +8319,7 @@
     <w:p>
       <w:r>
         <w:pict w14:anchorId="3C05518B">
-          <v:rect id="_x0000_i2101" style="width:0;height:1.5pt" o:hralign="center" o:hrstd="t" o:hr="t" fillcolor="#a0a0a0" stroked="f"/>
+          <v:rect id="_x0000_i1068" style="width:0;height:1.5pt" o:hralign="center" o:hrstd="t" o:hr="t" fillcolor="#a0a0a0" stroked="f"/>
         </w:pict>
       </w:r>
     </w:p>
@@ -8417,7 +8401,7 @@
     <w:p>
       <w:r>
         <w:pict w14:anchorId="3316277A">
-          <v:rect id="_x0000_i2102" style="width:0;height:1.5pt" o:hralign="center" o:hrstd="t" o:hr="t" fillcolor="#a0a0a0" stroked="f"/>
+          <v:rect id="_x0000_i1069" style="width:0;height:1.5pt" o:hralign="center" o:hrstd="t" o:hr="t" fillcolor="#a0a0a0" stroked="f"/>
         </w:pict>
       </w:r>
     </w:p>
@@ -8483,7 +8467,7 @@
     <w:p>
       <w:r>
         <w:pict w14:anchorId="73F52EF6">
-          <v:rect id="_x0000_i2103" style="width:0;height:1.5pt" o:hralign="center" o:hrstd="t" o:hr="t" fillcolor="#a0a0a0" stroked="f"/>
+          <v:rect id="_x0000_i1070" style="width:0;height:1.5pt" o:hralign="center" o:hrstd="t" o:hr="t" fillcolor="#a0a0a0" stroked="f"/>
         </w:pict>
       </w:r>
     </w:p>
@@ -8653,7 +8637,7 @@
     <w:p>
       <w:r>
         <w:pict w14:anchorId="201783B0">
-          <v:rect id="_x0000_i2104" style="width:0;height:1.5pt" o:hralign="center" o:hrstd="t" o:hr="t" fillcolor="#a0a0a0" stroked="f"/>
+          <v:rect id="_x0000_i1071" style="width:0;height:1.5pt" o:hralign="center" o:hrstd="t" o:hr="t" fillcolor="#a0a0a0" stroked="f"/>
         </w:pict>
       </w:r>
     </w:p>
@@ -9024,7 +9008,7 @@
     <w:p>
       <w:r>
         <w:pict w14:anchorId="4123B534">
-          <v:rect id="_x0000_i2105" style="width:0;height:1.5pt" o:hralign="center" o:hrstd="t" o:hr="t" fillcolor="#a0a0a0" stroked="f"/>
+          <v:rect id="_x0000_i1072" style="width:0;height:1.5pt" o:hralign="center" o:hrstd="t" o:hr="t" fillcolor="#a0a0a0" stroked="f"/>
         </w:pict>
       </w:r>
     </w:p>
@@ -9095,7 +9079,7 @@
     <w:p>
       <w:r>
         <w:pict w14:anchorId="11EB638F">
-          <v:rect id="_x0000_i2106" style="width:0;height:1.5pt" o:hralign="center" o:hrstd="t" o:hr="t" fillcolor="#a0a0a0" stroked="f"/>
+          <v:rect id="_x0000_i1073" style="width:0;height:1.5pt" o:hralign="center" o:hrstd="t" o:hr="t" fillcolor="#a0a0a0" stroked="f"/>
         </w:pict>
       </w:r>
     </w:p>
@@ -9525,7 +9509,7 @@
     <w:p>
       <w:r>
         <w:pict w14:anchorId="0E572C5C">
-          <v:rect id="_x0000_i2107" style="width:0;height:1.5pt" o:hralign="center" o:hrstd="t" o:hr="t" fillcolor="#a0a0a0" stroked="f"/>
+          <v:rect id="_x0000_i1074" style="width:0;height:1.5pt" o:hralign="center" o:hrstd="t" o:hr="t" fillcolor="#a0a0a0" stroked="f"/>
         </w:pict>
       </w:r>
     </w:p>
@@ -9722,7 +9706,7 @@
     <w:p>
       <w:r>
         <w:pict w14:anchorId="414D7CDE">
-          <v:rect id="_x0000_i2108" style="width:0;height:1.5pt" o:hralign="center" o:hrstd="t" o:hr="t" fillcolor="#a0a0a0" stroked="f"/>
+          <v:rect id="_x0000_i1075" style="width:0;height:1.5pt" o:hralign="center" o:hrstd="t" o:hr="t" fillcolor="#a0a0a0" stroked="f"/>
         </w:pict>
       </w:r>
     </w:p>
@@ -10008,6 +9992,7 @@
     <w:tbl>
       <w:tblPr>
         <w:tblStyle w:val="PlainTable1"/>
+        <w:tblpPr w:leftFromText="180" w:rightFromText="180" w:vertAnchor="page" w:horzAnchor="margin" w:tblpY="4440"/>
         <w:tblW w:w="0" w:type="auto"/>
         <w:tblLook w:val="04A0" w:firstRow="1" w:lastRow="0" w:firstColumn="1" w:lastColumn="0" w:noHBand="0" w:noVBand="1"/>
       </w:tblPr>
@@ -10188,17 +10173,9 @@
     <w:p>
       <w:r>
         <w:pict w14:anchorId="54BC3A5F">
-          <v:rect id="_x0000_i2109" style="width:0;height:1.5pt" o:hralign="center" o:hrstd="t" o:hr="t" fillcolor="#a0a0a0" stroked="f"/>
+          <v:rect id="_x0000_i1076" style="width:0;height:1.5pt" o:hralign="center" o:hrstd="t" o:hr="t" fillcolor="#a0a0a0" stroked="f"/>
         </w:pict>
       </w:r>
-    </w:p>
-    <w:p>
-      <w:pPr>
-        <w:rPr>
-          <w:b/>
-          <w:bCs/>
-        </w:rPr>
-      </w:pPr>
       <w:r>
         <w:rPr>
           <w:b/>
@@ -10390,7 +10367,7 @@
     <w:p>
       <w:r>
         <w:pict w14:anchorId="541833AA">
-          <v:rect id="_x0000_i2110" style="width:0;height:1.5pt" o:hralign="center" o:hrstd="t" o:hr="t" fillcolor="#a0a0a0" stroked="f"/>
+          <v:rect id="_x0000_i1077" style="width:0;height:1.5pt" o:hralign="center" o:hrstd="t" o:hr="t" fillcolor="#a0a0a0" stroked="f"/>
         </w:pict>
       </w:r>
     </w:p>
@@ -10452,7 +10429,7 @@
     <w:p>
       <w:r>
         <w:pict w14:anchorId="3F82E2D7">
-          <v:rect id="_x0000_i2111" style="width:0;height:1.5pt" o:hralign="center" o:hrstd="t" o:hr="t" fillcolor="#a0a0a0" stroked="f"/>
+          <v:rect id="_x0000_i1078" style="width:0;height:1.5pt" o:hralign="center" o:hrstd="t" o:hr="t" fillcolor="#a0a0a0" stroked="f"/>
         </w:pict>
       </w:r>
     </w:p>
@@ -10547,7 +10524,7 @@
     <w:p>
       <w:r>
         <w:pict w14:anchorId="1B452308">
-          <v:rect id="_x0000_i2112" style="width:0;height:1.5pt" o:hralign="center" o:hrstd="t" o:hr="t" fillcolor="#a0a0a0" stroked="f"/>
+          <v:rect id="_x0000_i1079" style="width:0;height:1.5pt" o:hralign="center" o:hrstd="t" o:hr="t" fillcolor="#a0a0a0" stroked="f"/>
         </w:pict>
       </w:r>
     </w:p>
@@ -10563,7 +10540,6 @@
           <w:b/>
           <w:bCs/>
         </w:rPr>
-        <w:lastRenderedPageBreak/>
         <w:t>2. Four Types of Measurement Scales</w:t>
       </w:r>
     </w:p>
@@ -10755,6 +10731,7 @@
               <w:spacing w:after="160" w:line="259" w:lineRule="auto"/>
             </w:pPr>
             <w:r>
+              <w:lastRenderedPageBreak/>
               <w:t>Interval Scale</w:t>
             </w:r>
           </w:p>
@@ -10856,7 +10833,7 @@
     <w:p>
       <w:r>
         <w:pict w14:anchorId="465DA3FA">
-          <v:rect id="_x0000_i2113" style="width:0;height:1.5pt" o:hralign="center" o:hrstd="t" o:hr="t" fillcolor="#a0a0a0" stroked="f"/>
+          <v:rect id="_x0000_i1080" style="width:0;height:1.5pt" o:hralign="center" o:hrstd="t" o:hr="t" fillcolor="#a0a0a0" stroked="f"/>
         </w:pict>
       </w:r>
     </w:p>
@@ -10928,7 +10905,7 @@
     <w:p>
       <w:r>
         <w:pict w14:anchorId="11687EE5">
-          <v:rect id="_x0000_i2114" style="width:0;height:1.5pt" o:hralign="center" o:hrstd="t" o:hr="t" fillcolor="#a0a0a0" stroked="f"/>
+          <v:rect id="_x0000_i1081" style="width:0;height:1.5pt" o:hralign="center" o:hrstd="t" o:hr="t" fillcolor="#a0a0a0" stroked="f"/>
         </w:pict>
       </w:r>
     </w:p>
@@ -11103,7 +11080,7 @@
     <w:p>
       <w:r>
         <w:pict w14:anchorId="70D8DF32">
-          <v:rect id="_x0000_i2115" style="width:0;height:1.5pt" o:hralign="center" o:hrstd="t" o:hr="t" fillcolor="#a0a0a0" stroked="f"/>
+          <v:rect id="_x0000_i1082" style="width:0;height:1.5pt" o:hralign="center" o:hrstd="t" o:hr="t" fillcolor="#a0a0a0" stroked="f"/>
         </w:pict>
       </w:r>
     </w:p>
@@ -11325,7 +11302,7 @@
     <w:p>
       <w:r>
         <w:pict w14:anchorId="4AF7705B">
-          <v:rect id="_x0000_i2116" style="width:0;height:1.5pt" o:hralign="center" o:hrstd="t" o:hr="t" fillcolor="#a0a0a0" stroked="f"/>
+          <v:rect id="_x0000_i1083" style="width:0;height:1.5pt" o:hralign="center" o:hrstd="t" o:hr="t" fillcolor="#a0a0a0" stroked="f"/>
         </w:pict>
       </w:r>
     </w:p>
@@ -11368,7 +11345,6 @@
         </w:numPr>
       </w:pPr>
       <w:r>
-        <w:lastRenderedPageBreak/>
         <w:t>frequency distribution</w:t>
       </w:r>
     </w:p>
@@ -11480,6 +11456,7 @@
               <w:spacing w:after="160" w:line="259" w:lineRule="auto"/>
             </w:pPr>
             <w:r>
+              <w:lastRenderedPageBreak/>
               <w:t>B</w:t>
             </w:r>
           </w:p>
@@ -11539,7 +11516,7 @@
     <w:p>
       <w:r>
         <w:pict w14:anchorId="119E422E">
-          <v:rect id="_x0000_i2117" style="width:0;height:1.5pt" o:hralign="center" o:hrstd="t" o:hr="t" fillcolor="#a0a0a0" stroked="f"/>
+          <v:rect id="_x0000_i1084" style="width:0;height:1.5pt" o:hralign="center" o:hrstd="t" o:hr="t" fillcolor="#a0a0a0" stroked="f"/>
         </w:pict>
       </w:r>
     </w:p>
@@ -11621,7 +11598,7 @@
     <w:p>
       <w:r>
         <w:pict w14:anchorId="7F5DA07F">
-          <v:rect id="_x0000_i2118" style="width:0;height:1.5pt" o:hralign="center" o:hrstd="t" o:hr="t" fillcolor="#a0a0a0" stroked="f"/>
+          <v:rect id="_x0000_i1085" style="width:0;height:1.5pt" o:hralign="center" o:hrstd="t" o:hr="t" fillcolor="#a0a0a0" stroked="f"/>
         </w:pict>
       </w:r>
     </w:p>
@@ -11791,7 +11768,7 @@
     <w:p>
       <w:r>
         <w:pict w14:anchorId="45E31468">
-          <v:rect id="_x0000_i2119" style="width:0;height:1.5pt" o:hralign="center" o:hrstd="t" o:hr="t" fillcolor="#a0a0a0" stroked="f"/>
+          <v:rect id="_x0000_i1086" style="width:0;height:1.5pt" o:hralign="center" o:hrstd="t" o:hr="t" fillcolor="#a0a0a0" stroked="f"/>
         </w:pict>
       </w:r>
     </w:p>
@@ -12070,7 +12047,7 @@
     <w:p>
       <w:r>
         <w:pict w14:anchorId="3392C5C1">
-          <v:rect id="_x0000_i2120" style="width:0;height:1.5pt" o:hralign="center" o:hrstd="t" o:hr="t" fillcolor="#a0a0a0" stroked="f"/>
+          <v:rect id="_x0000_i1087" style="width:0;height:1.5pt" o:hralign="center" o:hrstd="t" o:hr="t" fillcolor="#a0a0a0" stroked="f"/>
         </w:pict>
       </w:r>
     </w:p>
@@ -12113,7 +12090,6 @@
               <w:spacing w:after="160" w:line="259" w:lineRule="auto"/>
             </w:pPr>
             <w:r>
-              <w:lastRenderedPageBreak/>
               <w:t>Level</w:t>
             </w:r>
           </w:p>
@@ -12188,6 +12164,7 @@
               <w:spacing w:after="160" w:line="259" w:lineRule="auto"/>
             </w:pPr>
             <w:r>
+              <w:lastRenderedPageBreak/>
               <w:t>PhD</w:t>
             </w:r>
           </w:p>
@@ -12212,7 +12189,7 @@
     <w:p>
       <w:r>
         <w:pict w14:anchorId="20B94D24">
-          <v:rect id="_x0000_i2121" style="width:0;height:1.5pt" o:hralign="center" o:hrstd="t" o:hr="t" fillcolor="#a0a0a0" stroked="f"/>
+          <v:rect id="_x0000_i1088" style="width:0;height:1.5pt" o:hralign="center" o:hrstd="t" o:hr="t" fillcolor="#a0a0a0" stroked="f"/>
         </w:pict>
       </w:r>
     </w:p>
@@ -12287,7 +12264,7 @@
     <w:p>
       <w:r>
         <w:pict w14:anchorId="7FD11140">
-          <v:rect id="_x0000_i2122" style="width:0;height:1.5pt" o:hralign="center" o:hrstd="t" o:hr="t" fillcolor="#a0a0a0" stroked="f"/>
+          <v:rect id="_x0000_i1089" style="width:0;height:1.5pt" o:hralign="center" o:hrstd="t" o:hr="t" fillcolor="#a0a0a0" stroked="f"/>
         </w:pict>
       </w:r>
     </w:p>
@@ -12364,7 +12341,7 @@
     <w:p>
       <w:r>
         <w:pict w14:anchorId="128FC6C7">
-          <v:rect id="_x0000_i2123" style="width:0;height:1.5pt" o:hralign="center" o:hrstd="t" o:hr="t" fillcolor="#a0a0a0" stroked="f"/>
+          <v:rect id="_x0000_i1090" style="width:0;height:1.5pt" o:hralign="center" o:hrstd="t" o:hr="t" fillcolor="#a0a0a0" stroked="f"/>
         </w:pict>
       </w:r>
     </w:p>
@@ -12534,7 +12511,7 @@
     <w:p>
       <w:r>
         <w:pict w14:anchorId="30C983F4">
-          <v:rect id="_x0000_i2124" style="width:0;height:1.5pt" o:hralign="center" o:hrstd="t" o:hr="t" fillcolor="#a0a0a0" stroked="f"/>
+          <v:rect id="_x0000_i1091" style="width:0;height:1.5pt" o:hralign="center" o:hrstd="t" o:hr="t" fillcolor="#a0a0a0" stroked="f"/>
         </w:pict>
       </w:r>
     </w:p>
@@ -12723,7 +12700,6 @@
     </w:p>
     <w:p>
       <w:r>
-        <w:lastRenderedPageBreak/>
         <w:t>However:</w:t>
       </w:r>
     </w:p>
@@ -12745,7 +12721,7 @@
     <w:p>
       <w:r>
         <w:pict w14:anchorId="3DD8024E">
-          <v:rect id="_x0000_i2125" style="width:0;height:1.5pt" o:hralign="center" o:hrstd="t" o:hr="t" fillcolor="#a0a0a0" stroked="f"/>
+          <v:rect id="_x0000_i1092" style="width:0;height:1.5pt" o:hralign="center" o:hrstd="t" o:hr="t" fillcolor="#a0a0a0" stroked="f"/>
         </w:pict>
       </w:r>
     </w:p>
@@ -12788,6 +12764,7 @@
               <w:spacing w:after="160" w:line="259" w:lineRule="auto"/>
             </w:pPr>
             <w:r>
+              <w:lastRenderedPageBreak/>
               <w:t>Year</w:t>
             </w:r>
           </w:p>
@@ -12869,7 +12846,7 @@
     <w:p>
       <w:r>
         <w:pict w14:anchorId="22DD3BEF">
-          <v:rect id="_x0000_i2126" style="width:0;height:1.5pt" o:hralign="center" o:hrstd="t" o:hr="t" fillcolor="#a0a0a0" stroked="f"/>
+          <v:rect id="_x0000_i1093" style="width:0;height:1.5pt" o:hralign="center" o:hrstd="t" o:hr="t" fillcolor="#a0a0a0" stroked="f"/>
         </w:pict>
       </w:r>
     </w:p>
@@ -12976,7 +12953,7 @@
     <w:p>
       <w:r>
         <w:pict w14:anchorId="1C51123F">
-          <v:rect id="_x0000_i2127" style="width:0;height:1.5pt" o:hralign="center" o:hrstd="t" o:hr="t" fillcolor="#a0a0a0" stroked="f"/>
+          <v:rect id="_x0000_i1094" style="width:0;height:1.5pt" o:hralign="center" o:hrstd="t" o:hr="t" fillcolor="#a0a0a0" stroked="f"/>
         </w:pict>
       </w:r>
     </w:p>
@@ -13058,7 +13035,7 @@
     <w:p>
       <w:r>
         <w:pict w14:anchorId="6D35CD3B">
-          <v:rect id="_x0000_i2128" style="width:0;height:1.5pt" o:hralign="center" o:hrstd="t" o:hr="t" fillcolor="#a0a0a0" stroked="f"/>
+          <v:rect id="_x0000_i1095" style="width:0;height:1.5pt" o:hralign="center" o:hrstd="t" o:hr="t" fillcolor="#a0a0a0" stroked="f"/>
         </w:pict>
       </w:r>
     </w:p>
@@ -13260,7 +13237,7 @@
     <w:p>
       <w:r>
         <w:pict w14:anchorId="440F422D">
-          <v:rect id="_x0000_i2129" style="width:0;height:1.5pt" o:hralign="center" o:hrstd="t" o:hr="t" fillcolor="#a0a0a0" stroked="f"/>
+          <v:rect id="_x0000_i1096" style="width:0;height:1.5pt" o:hralign="center" o:hrstd="t" o:hr="t" fillcolor="#a0a0a0" stroked="f"/>
         </w:pict>
       </w:r>
     </w:p>
@@ -13276,7 +13253,6 @@
           <w:b/>
           <w:bCs/>
         </w:rPr>
-        <w:lastRenderedPageBreak/>
         <w:t>Examples</w:t>
       </w:r>
     </w:p>
@@ -13407,6 +13383,7 @@
               <w:spacing w:after="160" w:line="259" w:lineRule="auto"/>
             </w:pPr>
             <w:r>
+              <w:lastRenderedPageBreak/>
               <w:t>Age</w:t>
             </w:r>
           </w:p>
@@ -13493,7 +13470,7 @@
     <w:p>
       <w:r>
         <w:pict w14:anchorId="186A8800">
-          <v:rect id="_x0000_i2130" style="width:0;height:1.5pt" o:hralign="center" o:hrstd="t" o:hr="t" fillcolor="#a0a0a0" stroked="f"/>
+          <v:rect id="_x0000_i1097" style="width:0;height:1.5pt" o:hralign="center" o:hrstd="t" o:hr="t" fillcolor="#a0a0a0" stroked="f"/>
         </w:pict>
       </w:r>
     </w:p>
@@ -13589,9 +13566,7 @@
     </w:p>
     <w:p>
       <w:r>
-        <w:pict w14:anchorId="49F01EB3">
-          <v:rect id="_x0000_i2131" style="width:0;height:1.5pt" o:hralign="center" o:hrstd="t" o:hr="t" fillcolor="#a0a0a0" stroked="f"/>
-        </w:pict>
+        <w:t xml:space="preserve"> </w:t>
       </w:r>
     </w:p>
     <w:p>
@@ -14100,7 +14075,7 @@
     <w:p>
       <w:r>
         <w:pict w14:anchorId="1BD6836F">
-          <v:rect id="_x0000_i2132" style="width:0;height:1.5pt" o:hralign="center" o:hrstd="t" o:hr="t" fillcolor="#a0a0a0" stroked="f"/>
+          <v:rect id="_x0000_i1099" style="width:0;height:1.5pt" o:hralign="center" o:hrstd="t" o:hr="t" fillcolor="#a0a0a0" stroked="f"/>
         </w:pict>
       </w:r>
     </w:p>
@@ -14309,7 +14284,6 @@
               <w:spacing w:after="160" w:line="259" w:lineRule="auto"/>
             </w:pPr>
             <w:r>
-              <w:lastRenderedPageBreak/>
               <w:t>B</w:t>
             </w:r>
           </w:p>
@@ -14510,6 +14484,7 @@
               <w:spacing w:after="160" w:line="259" w:lineRule="auto"/>
             </w:pPr>
             <w:r>
+              <w:lastRenderedPageBreak/>
               <w:t>Temperature</w:t>
             </w:r>
           </w:p>
@@ -14566,7 +14541,7 @@
     <w:p>
       <w:r>
         <w:pict w14:anchorId="0F7CFAF7">
-          <v:rect id="_x0000_i2133" style="width:0;height:1.5pt" o:hralign="center" o:hrstd="t" o:hr="t" fillcolor="#a0a0a0" stroked="f"/>
+          <v:rect id="_x0000_i1100" style="width:0;height:1.5pt" o:hralign="center" o:hrstd="t" o:hr="t" fillcolor="#a0a0a0" stroked="f"/>
         </w:pict>
       </w:r>
     </w:p>
@@ -14768,7 +14743,7 @@
     <w:p>
       <w:r>
         <w:pict w14:anchorId="48B48DB4">
-          <v:rect id="_x0000_i2134" style="width:0;height:1.5pt" o:hralign="center" o:hrstd="t" o:hr="t" fillcolor="#a0a0a0" stroked="f"/>
+          <v:rect id="_x0000_i1101" style="width:0;height:1.5pt" o:hralign="center" o:hrstd="t" o:hr="t" fillcolor="#a0a0a0" stroked="f"/>
         </w:pict>
       </w:r>
     </w:p>
@@ -14810,7 +14785,7 @@
     <w:p>
       <w:r>
         <w:pict w14:anchorId="51AD002A">
-          <v:rect id="_x0000_i2135" style="width:0;height:1.5pt" o:hralign="center" o:hrstd="t" o:hr="t" fillcolor="#a0a0a0" stroked="f"/>
+          <v:rect id="_x0000_i1102" style="width:0;height:1.5pt" o:hralign="center" o:hrstd="t" o:hr="t" fillcolor="#a0a0a0" stroked="f"/>
         </w:pict>
       </w:r>
     </w:p>
@@ -14883,7 +14858,7 @@
     <w:p>
       <w:r>
         <w:pict w14:anchorId="74EC39ED">
-          <v:rect id="_x0000_i2136" style="width:0;height:1.5pt" o:hralign="center" o:hrstd="t" o:hr="t" fillcolor="#a0a0a0" stroked="f"/>
+          <v:rect id="_x0000_i1103" style="width:0;height:1.5pt" o:hralign="center" o:hrstd="t" o:hr="t" fillcolor="#a0a0a0" stroked="f"/>
         </w:pict>
       </w:r>
     </w:p>
@@ -14949,7 +14924,7 @@
     <w:p>
       <w:r>
         <w:pict w14:anchorId="25771DCE">
-          <v:rect id="_x0000_i2137" style="width:0;height:1.5pt" o:hralign="center" o:hrstd="t" o:hr="t" fillcolor="#a0a0a0" stroked="f"/>
+          <v:rect id="_x0000_i1104" style="width:0;height:1.5pt" o:hralign="center" o:hrstd="t" o:hr="t" fillcolor="#a0a0a0" stroked="f"/>
         </w:pict>
       </w:r>
     </w:p>
@@ -15060,7 +15035,6 @@
               <w:spacing w:after="160" w:line="259" w:lineRule="auto"/>
             </w:pPr>
             <w:r>
-              <w:lastRenderedPageBreak/>
               <w:t>Election survey</w:t>
             </w:r>
           </w:p>
@@ -15152,7 +15126,7 @@
     <w:p>
       <w:r>
         <w:pict w14:anchorId="65BF201B">
-          <v:rect id="_x0000_i2138" style="width:0;height:1.5pt" o:hralign="center" o:hrstd="t" o:hr="t" fillcolor="#a0a0a0" stroked="f"/>
+          <v:rect id="_x0000_i1105" style="width:0;height:1.5pt" o:hralign="center" o:hrstd="t" o:hr="t" fillcolor="#a0a0a0" stroked="f"/>
         </w:pict>
       </w:r>
     </w:p>
@@ -15173,6 +15147,7 @@
     </w:p>
     <w:p>
       <w:r>
+        <w:lastRenderedPageBreak/>
         <w:t xml:space="preserve">Suppose a university wants to study the </w:t>
       </w:r>
       <w:r>
@@ -15219,7 +15194,7 @@
     <w:p>
       <w:r>
         <w:pict w14:anchorId="703F9574">
-          <v:rect id="_x0000_i2139" style="width:0;height:1.5pt" o:hralign="center" o:hrstd="t" o:hr="t" fillcolor="#a0a0a0" stroked="f"/>
+          <v:rect id="_x0000_i1106" style="width:0;height:1.5pt" o:hralign="center" o:hrstd="t" o:hr="t" fillcolor="#a0a0a0" stroked="f"/>
         </w:pict>
       </w:r>
     </w:p>
@@ -15409,7 +15384,7 @@
     <w:p>
       <w:r>
         <w:pict w14:anchorId="525587B0">
-          <v:rect id="_x0000_i2140" style="width:0;height:1.5pt" o:hralign="center" o:hrstd="t" o:hr="t" fillcolor="#a0a0a0" stroked="f"/>
+          <v:rect id="_x0000_i1107" style="width:0;height:1.5pt" o:hralign="center" o:hrstd="t" o:hr="t" fillcolor="#a0a0a0" stroked="f"/>
         </w:pict>
       </w:r>
     </w:p>
@@ -15549,7 +15524,7 @@
     <w:p>
       <w:r>
         <w:pict w14:anchorId="36435137">
-          <v:rect id="_x0000_i2141" style="width:0;height:1.5pt" o:hralign="center" o:hrstd="t" o:hr="t" fillcolor="#a0a0a0" stroked="f"/>
+          <v:rect id="_x0000_i1108" style="width:0;height:1.5pt" o:hralign="center" o:hrstd="t" o:hr="t" fillcolor="#a0a0a0" stroked="f"/>
         </w:pict>
       </w:r>
     </w:p>
@@ -15719,7 +15694,7 @@
     <w:p>
       <w:r>
         <w:pict w14:anchorId="4F8F827F">
-          <v:rect id="_x0000_i2142" style="width:0;height:1.5pt" o:hralign="center" o:hrstd="t" o:hr="t" fillcolor="#a0a0a0" stroked="f"/>
+          <v:rect id="_x0000_i1109" style="width:0;height:1.5pt" o:hralign="center" o:hrstd="t" o:hr="t" fillcolor="#a0a0a0" stroked="f"/>
         </w:pict>
       </w:r>
     </w:p>
@@ -15782,7 +15757,6 @@
               <w:spacing w:after="160" w:line="259" w:lineRule="auto"/>
             </w:pPr>
             <w:r>
-              <w:lastRenderedPageBreak/>
               <w:t>number of possible coin toss outcomes</w:t>
             </w:r>
           </w:p>
@@ -15824,7 +15798,7 @@
     <w:p>
       <w:r>
         <w:pict w14:anchorId="4F8E21F8">
-          <v:rect id="_x0000_i2143" style="width:0;height:1.5pt" o:hralign="center" o:hrstd="t" o:hr="t" fillcolor="#a0a0a0" stroked="f"/>
+          <v:rect id="_x0000_i1110" style="width:0;height:1.5pt" o:hralign="center" o:hrstd="t" o:hr="t" fillcolor="#a0a0a0" stroked="f"/>
         </w:pict>
       </w:r>
     </w:p>
@@ -15880,6 +15854,7 @@
     </w:p>
     <w:p>
       <w:r>
+        <w:lastRenderedPageBreak/>
         <w:t xml:space="preserve">Instead of studying the entire population, researchers </w:t>
       </w:r>
       <w:proofErr w:type="spellStart"/>
@@ -15904,7 +15879,7 @@
     <w:p>
       <w:r>
         <w:pict w14:anchorId="1ABA0D26">
-          <v:rect id="_x0000_i2144" style="width:0;height:1.5pt" o:hralign="center" o:hrstd="t" o:hr="t" fillcolor="#a0a0a0" stroked="f"/>
+          <v:rect id="_x0000_i1111" style="width:0;height:1.5pt" o:hralign="center" o:hrstd="t" o:hr="t" fillcolor="#a0a0a0" stroked="f"/>
         </w:pict>
       </w:r>
     </w:p>
@@ -15958,7 +15933,7 @@
     <w:p>
       <w:r>
         <w:pict w14:anchorId="6E972D6A">
-          <v:rect id="_x0000_i2145" style="width:0;height:1.5pt" o:hralign="center" o:hrstd="t" o:hr="t" fillcolor="#a0a0a0" stroked="f"/>
+          <v:rect id="_x0000_i1112" style="width:0;height:1.5pt" o:hralign="center" o:hrstd="t" o:hr="t" fillcolor="#a0a0a0" stroked="f"/>
         </w:pict>
       </w:r>
     </w:p>
@@ -16133,7 +16108,7 @@
     <w:p>
       <w:r>
         <w:pict w14:anchorId="38B627B4">
-          <v:rect id="_x0000_i2146" style="width:0;height:1.5pt" o:hralign="center" o:hrstd="t" o:hr="t" fillcolor="#a0a0a0" stroked="f"/>
+          <v:rect id="_x0000_i1113" style="width:0;height:1.5pt" o:hralign="center" o:hrstd="t" o:hr="t" fillcolor="#a0a0a0" stroked="f"/>
         </w:pict>
       </w:r>
     </w:p>
@@ -16345,7 +16320,7 @@
     <w:p>
       <w:r>
         <w:pict w14:anchorId="3F1E0952">
-          <v:rect id="_x0000_i2147" style="width:0;height:1.5pt" o:hralign="center" o:hrstd="t" o:hr="t" fillcolor="#a0a0a0" stroked="f"/>
+          <v:rect id="_x0000_i1114" style="width:0;height:1.5pt" o:hralign="center" o:hrstd="t" o:hr="t" fillcolor="#a0a0a0" stroked="f"/>
         </w:pict>
       </w:r>
     </w:p>
@@ -16391,7 +16366,6 @@
     </w:p>
     <w:p>
       <w:r>
-        <w:lastRenderedPageBreak/>
         <w:t>Instead:</w:t>
       </w:r>
     </w:p>
@@ -16438,7 +16412,7 @@
     <w:p>
       <w:r>
         <w:pict w14:anchorId="7E585BF6">
-          <v:rect id="_x0000_i2148" style="width:0;height:1.5pt" o:hralign="center" o:hrstd="t" o:hr="t" fillcolor="#a0a0a0" stroked="f"/>
+          <v:rect id="_x0000_i1115" style="width:0;height:1.5pt" o:hralign="center" o:hrstd="t" o:hr="t" fillcolor="#a0a0a0" stroked="f"/>
         </w:pict>
       </w:r>
     </w:p>
@@ -16483,6 +16457,7 @@
               <w:spacing w:after="160" w:line="259" w:lineRule="auto"/>
             </w:pPr>
             <w:r>
+              <w:lastRenderedPageBreak/>
               <w:t>Feature</w:t>
             </w:r>
           </w:p>
@@ -16721,7 +16696,7 @@
     <w:p>
       <w:r>
         <w:pict w14:anchorId="1ECCF005">
-          <v:rect id="_x0000_i2149" style="width:0;height:1.5pt" o:hralign="center" o:hrstd="t" o:hr="t" fillcolor="#a0a0a0" stroked="f"/>
+          <v:rect id="_x0000_i1116" style="width:0;height:1.5pt" o:hralign="center" o:hrstd="t" o:hr="t" fillcolor="#a0a0a0" stroked="f"/>
         </w:pict>
       </w:r>
     </w:p>
@@ -16861,7 +16836,7 @@
     <w:p>
       <w:r>
         <w:pict w14:anchorId="3720A8D6">
-          <v:rect id="_x0000_i2150" style="width:0;height:1.5pt" o:hralign="center" o:hrstd="t" o:hr="t" fillcolor="#a0a0a0" stroked="f"/>
+          <v:rect id="_x0000_i1117" style="width:0;height:1.5pt" o:hralign="center" o:hrstd="t" o:hr="t" fillcolor="#a0a0a0" stroked="f"/>
         </w:pict>
       </w:r>
     </w:p>
@@ -17121,7 +17096,7 @@
     <w:p>
       <w:r>
         <w:pict w14:anchorId="7AF9FC58">
-          <v:rect id="_x0000_i2151" style="width:0;height:1.5pt" o:hralign="center" o:hrstd="t" o:hr="t" fillcolor="#a0a0a0" stroked="f"/>
+          <v:rect id="_x0000_i1118" style="width:0;height:1.5pt" o:hralign="center" o:hrstd="t" o:hr="t" fillcolor="#a0a0a0" stroked="f"/>
         </w:pict>
       </w:r>
     </w:p>
@@ -17147,7 +17122,6 @@
     </w:p>
     <w:p>
       <w:r>
-        <w:lastRenderedPageBreak/>
         <w:t>Define Population</w:t>
       </w:r>
       <w:r>
@@ -17197,8 +17171,9 @@
     </w:p>
     <w:p>
       <w:r>
+        <w:lastRenderedPageBreak/>
         <w:pict w14:anchorId="6352BDAB">
-          <v:rect id="_x0000_i2152" style="width:0;height:1.5pt" o:hralign="center" o:hrstd="t" o:hr="t" fillcolor="#a0a0a0" stroked="f"/>
+          <v:rect id="_x0000_i1119" style="width:0;height:1.5pt" o:hralign="center" o:hrstd="t" o:hr="t" fillcolor="#a0a0a0" stroked="f"/>
         </w:pict>
       </w:r>
     </w:p>
@@ -17308,7 +17283,7 @@
     <w:p>
       <w:r>
         <w:pict w14:anchorId="78433324">
-          <v:rect id="_x0000_i2153" style="width:0;height:1.5pt" o:hralign="center" o:hrstd="t" o:hr="t" fillcolor="#a0a0a0" stroked="f"/>
+          <v:rect id="_x0000_i1120" style="width:0;height:1.5pt" o:hralign="center" o:hrstd="t" o:hr="t" fillcolor="#a0a0a0" stroked="f"/>
         </w:pict>
       </w:r>
     </w:p>
@@ -17388,7 +17363,7 @@
     <w:p>
       <w:r>
         <w:pict w14:anchorId="450DED1B">
-          <v:rect id="_x0000_i2154" style="width:0;height:1.5pt" o:hralign="center" o:hrstd="t" o:hr="t" fillcolor="#a0a0a0" stroked="f"/>
+          <v:rect id="_x0000_i1121" style="width:0;height:1.5pt" o:hralign="center" o:hrstd="t" o:hr="t" fillcolor="#a0a0a0" stroked="f"/>
         </w:pict>
       </w:r>
     </w:p>
@@ -17566,7 +17541,6 @@
               <w:spacing w:after="160" w:line="259" w:lineRule="auto"/>
             </w:pPr>
             <w:r>
-              <w:lastRenderedPageBreak/>
               <w:t>Statistic</w:t>
             </w:r>
           </w:p>
@@ -17591,7 +17565,7 @@
     <w:p>
       <w:r>
         <w:pict w14:anchorId="424DF68E">
-          <v:rect id="_x0000_i2155" style="width:0;height:1.5pt" o:hralign="center" o:hrstd="t" o:hr="t" fillcolor="#a0a0a0" stroked="f"/>
+          <v:rect id="_x0000_i1122" style="width:0;height:1.5pt" o:hralign="center" o:hrstd="t" o:hr="t" fillcolor="#a0a0a0" stroked="f"/>
         </w:pict>
       </w:r>
     </w:p>
@@ -17641,7 +17615,7 @@
     <w:p>
       <w:r>
         <w:pict w14:anchorId="43F885F2">
-          <v:rect id="_x0000_i2156" style="width:0;height:1.5pt" o:hralign="center" o:hrstd="t" o:hr="t" fillcolor="#a0a0a0" stroked="f"/>
+          <v:rect id="_x0000_i1123" style="width:0;height:1.5pt" o:hralign="center" o:hrstd="t" o:hr="t" fillcolor="#a0a0a0" stroked="f"/>
         </w:pict>
       </w:r>
     </w:p>
@@ -17662,6 +17636,7 @@
     </w:p>
     <w:p>
       <w:r>
+        <w:lastRenderedPageBreak/>
         <w:t xml:space="preserve">These concepts are used in statistics to </w:t>
       </w:r>
       <w:r>
@@ -17713,7 +17688,7 @@
     <w:p>
       <w:r>
         <w:pict w14:anchorId="30375F05">
-          <v:rect id="_x0000_i2157" style="width:0;height:1.5pt" o:hralign="center" o:hrstd="t" o:hr="t" fillcolor="#a0a0a0" stroked="f"/>
+          <v:rect id="_x0000_i1124" style="width:0;height:1.5pt" o:hralign="center" o:hrstd="t" o:hr="t" fillcolor="#a0a0a0" stroked="f"/>
         </w:pict>
       </w:r>
     </w:p>
@@ -17936,7 +17911,7 @@
     <w:p>
       <w:r>
         <w:pict w14:anchorId="57450EF1">
-          <v:rect id="_x0000_i2158" style="width:0;height:1.5pt" o:hralign="center" o:hrstd="t" o:hr="t" fillcolor="#a0a0a0" stroked="f"/>
+          <v:rect id="_x0000_i1125" style="width:0;height:1.5pt" o:hralign="center" o:hrstd="t" o:hr="t" fillcolor="#a0a0a0" stroked="f"/>
         </w:pict>
       </w:r>
     </w:p>
@@ -18002,7 +17977,7 @@
     <w:p>
       <w:r>
         <w:pict w14:anchorId="0F5B225F">
-          <v:rect id="_x0000_i2159" style="width:0;height:1.5pt" o:hralign="center" o:hrstd="t" o:hr="t" fillcolor="#a0a0a0" stroked="f"/>
+          <v:rect id="_x0000_i1126" style="width:0;height:1.5pt" o:hralign="center" o:hrstd="t" o:hr="t" fillcolor="#a0a0a0" stroked="f"/>
         </w:pict>
       </w:r>
     </w:p>
@@ -18232,73 +18207,73 @@
     </w:tbl>
     <w:p>
       <w:r>
+        <w:pict w14:anchorId="364262CA">
+          <v:rect id="_x0000_i1127" style="width:0;height:1.5pt" o:hralign="center" o:hrstd="t" o:hr="t" fillcolor="#a0a0a0" stroked="f"/>
+        </w:pict>
+      </w:r>
+    </w:p>
+    <w:p>
+      <w:pPr>
+        <w:rPr>
+          <w:b/>
+          <w:bCs/>
+        </w:rPr>
+      </w:pPr>
+      <w:r>
+        <w:rPr>
+          <w:b/>
+          <w:bCs/>
+        </w:rPr>
+        <w:t>Example Dataset</w:t>
+      </w:r>
+    </w:p>
+    <w:p>
+      <w:r>
+        <w:t>2, 4, 6, 8, 10, 12, 14, 16</w:t>
+      </w:r>
+    </w:p>
+    <w:p>
+      <w:r>
+        <w:t>Step 1: Find Median (Q2)</w:t>
+      </w:r>
+      <w:r>
+        <w:t xml:space="preserve"> :</w:t>
+      </w:r>
+    </w:p>
+    <w:p>
+      <w:r>
+        <w:t xml:space="preserve">Median = (8 + 10) / 2 = </w:t>
+      </w:r>
+      <w:r>
+        <w:rPr>
+          <w:b/>
+          <w:bCs/>
+        </w:rPr>
+        <w:t>9</w:t>
+      </w:r>
+    </w:p>
+    <w:p>
+      <w:r>
+        <w:t>Step 2: Find Q1</w:t>
+      </w:r>
+      <w:r>
+        <w:t xml:space="preserve">: </w:t>
+      </w:r>
+    </w:p>
+    <w:p>
+      <w:r>
+        <w:t>Lower half:</w:t>
+      </w:r>
+      <w:r>
+        <w:t xml:space="preserve"> </w:t>
+      </w:r>
+      <w:r>
+        <w:t>2, 4, 6, 8</w:t>
+      </w:r>
+    </w:p>
+    <w:p>
+      <w:r>
         <w:lastRenderedPageBreak/>
-        <w:pict w14:anchorId="364262CA">
-          <v:rect id="_x0000_i2160" style="width:0;height:1.5pt" o:hralign="center" o:hrstd="t" o:hr="t" fillcolor="#a0a0a0" stroked="f"/>
-        </w:pict>
-      </w:r>
-    </w:p>
-    <w:p>
-      <w:pPr>
-        <w:rPr>
-          <w:b/>
-          <w:bCs/>
-        </w:rPr>
-      </w:pPr>
-      <w:r>
-        <w:rPr>
-          <w:b/>
-          <w:bCs/>
-        </w:rPr>
-        <w:t>Example Dataset</w:t>
-      </w:r>
-    </w:p>
-    <w:p>
-      <w:r>
-        <w:t>2, 4, 6, 8, 10, 12, 14, 16</w:t>
-      </w:r>
-    </w:p>
-    <w:p>
-      <w:r>
-        <w:t>Step 1: Find Median (Q2)</w:t>
-      </w:r>
-      <w:r>
-        <w:t xml:space="preserve"> :</w:t>
-      </w:r>
-    </w:p>
-    <w:p>
-      <w:r>
-        <w:t xml:space="preserve">Median = (8 + 10) / 2 = </w:t>
-      </w:r>
-      <w:r>
-        <w:rPr>
-          <w:b/>
-          <w:bCs/>
-        </w:rPr>
-        <w:t>9</w:t>
-      </w:r>
-    </w:p>
-    <w:p>
-      <w:r>
-        <w:t>Step 2: Find Q1</w:t>
-      </w:r>
-      <w:r>
-        <w:t xml:space="preserve">: </w:t>
-      </w:r>
-    </w:p>
-    <w:p>
-      <w:r>
-        <w:t>Lower half:</w:t>
-      </w:r>
-      <w:r>
-        <w:t xml:space="preserve"> </w:t>
-      </w:r>
-      <w:r>
-        <w:t>2, 4, 6, 8</w:t>
-      </w:r>
-    </w:p>
-    <w:p>
-      <w:r>
         <w:t xml:space="preserve">Median = (4 + 6)/2 = </w:t>
       </w:r>
       <w:r>
@@ -18341,7 +18316,7 @@
     <w:p>
       <w:r>
         <w:pict w14:anchorId="2BD4B5C7">
-          <v:rect id="_x0000_i2161" style="width:0;height:1.5pt" o:hralign="center" o:hrstd="t" o:hr="t" fillcolor="#a0a0a0" stroked="f"/>
+          <v:rect id="_x0000_i1128" style="width:0;height:1.5pt" o:hralign="center" o:hrstd="t" o:hr="t" fillcolor="#a0a0a0" stroked="f"/>
         </w:pict>
       </w:r>
     </w:p>
@@ -18570,7 +18545,7 @@
     <w:p>
       <w:r>
         <w:pict w14:anchorId="1A4E5755">
-          <v:rect id="_x0000_i2162" style="width:0;height:1.5pt" o:hralign="center" o:hrstd="t" o:hr="t" fillcolor="#a0a0a0" stroked="f"/>
+          <v:rect id="_x0000_i1129" style="width:0;height:1.5pt" o:hralign="center" o:hrstd="t" o:hr="t" fillcolor="#a0a0a0" stroked="f"/>
         </w:pict>
       </w:r>
     </w:p>
@@ -18636,7 +18611,7 @@
     <w:p>
       <w:r>
         <w:pict w14:anchorId="4A7908A8">
-          <v:rect id="_x0000_i2163" style="width:0;height:1.5pt" o:hralign="center" o:hrstd="t" o:hr="t" fillcolor="#a0a0a0" stroked="f"/>
+          <v:rect id="_x0000_i1130" style="width:0;height:1.5pt" o:hralign="center" o:hrstd="t" o:hr="t" fillcolor="#a0a0a0" stroked="f"/>
         </w:pict>
       </w:r>
     </w:p>
@@ -18782,7 +18757,6 @@
               <w:spacing w:after="160" w:line="259" w:lineRule="auto"/>
             </w:pPr>
             <w:r>
-              <w:lastRenderedPageBreak/>
               <w:t>D3</w:t>
             </w:r>
           </w:p>
@@ -18874,7 +18848,7 @@
     <w:p>
       <w:r>
         <w:pict w14:anchorId="204DF863">
-          <v:rect id="_x0000_i2164" style="width:0;height:1.5pt" o:hralign="center" o:hrstd="t" o:hr="t" fillcolor="#a0a0a0" stroked="f"/>
+          <v:rect id="_x0000_i1131" style="width:0;height:1.5pt" o:hralign="center" o:hrstd="t" o:hr="t" fillcolor="#a0a0a0" stroked="f"/>
         </w:pict>
       </w:r>
     </w:p>
@@ -18931,8 +18905,9 @@
     </w:p>
     <w:p>
       <w:r>
+        <w:lastRenderedPageBreak/>
         <w:pict w14:anchorId="6A3EC242">
-          <v:rect id="_x0000_i2165" style="width:0;height:1.5pt" o:hralign="center" o:hrstd="t" o:hr="t" fillcolor="#a0a0a0" stroked="f"/>
+          <v:rect id="_x0000_i1132" style="width:0;height:1.5pt" o:hralign="center" o:hrstd="t" o:hr="t" fillcolor="#a0a0a0" stroked="f"/>
         </w:pict>
       </w:r>
     </w:p>
@@ -19107,7 +19082,7 @@
     <w:p>
       <w:r>
         <w:pict w14:anchorId="04AF4515">
-          <v:rect id="_x0000_i2166" style="width:0;height:1.5pt" o:hralign="center" o:hrstd="t" o:hr="t" fillcolor="#a0a0a0" stroked="f"/>
+          <v:rect id="_x0000_i1133" style="width:0;height:1.5pt" o:hralign="center" o:hrstd="t" o:hr="t" fillcolor="#a0a0a0" stroked="f"/>
         </w:pict>
       </w:r>
     </w:p>
@@ -19173,7 +19148,7 @@
     <w:p>
       <w:r>
         <w:pict w14:anchorId="52F9E7B5">
-          <v:rect id="_x0000_i2167" style="width:0;height:1.5pt" o:hralign="center" o:hrstd="t" o:hr="t" fillcolor="#a0a0a0" stroked="f"/>
+          <v:rect id="_x0000_i1134" style="width:0;height:1.5pt" o:hralign="center" o:hrstd="t" o:hr="t" fillcolor="#a0a0a0" stroked="f"/>
         </w:pict>
       </w:r>
     </w:p>
@@ -19375,7 +19350,7 @@
     <w:p>
       <w:r>
         <w:pict w14:anchorId="583AE39E">
-          <v:rect id="_x0000_i2168" style="width:0;height:1.5pt" o:hralign="center" o:hrstd="t" o:hr="t" fillcolor="#a0a0a0" stroked="f"/>
+          <v:rect id="_x0000_i1135" style="width:0;height:1.5pt" o:hralign="center" o:hrstd="t" o:hr="t" fillcolor="#a0a0a0" stroked="f"/>
         </w:pict>
       </w:r>
     </w:p>
@@ -19438,7 +19413,7 @@
     <w:p>
       <w:r>
         <w:pict w14:anchorId="663B0E92">
-          <v:rect id="_x0000_i2169" style="width:0;height:1.5pt" o:hralign="center" o:hrstd="t" o:hr="t" fillcolor="#a0a0a0" stroked="f"/>
+          <v:rect id="_x0000_i1136" style="width:0;height:1.5pt" o:hralign="center" o:hrstd="t" o:hr="t" fillcolor="#a0a0a0" stroked="f"/>
         </w:pict>
       </w:r>
     </w:p>
@@ -19454,7 +19429,6 @@
           <w:b/>
           <w:bCs/>
         </w:rPr>
-        <w:lastRenderedPageBreak/>
         <w:t>Real-World Example</w:t>
       </w:r>
     </w:p>
@@ -19571,6 +19545,7 @@
     </w:p>
     <w:p>
       <w:r>
+        <w:lastRenderedPageBreak/>
         <w:t xml:space="preserve">92% of students scored </w:t>
       </w:r>
       <w:r>
@@ -19587,7 +19562,7 @@
     <w:p>
       <w:r>
         <w:pict w14:anchorId="02AADFA5">
-          <v:rect id="_x0000_i2170" style="width:0;height:1.5pt" o:hralign="center" o:hrstd="t" o:hr="t" fillcolor="#a0a0a0" stroked="f"/>
+          <v:rect id="_x0000_i1137" style="width:0;height:1.5pt" o:hralign="center" o:hrstd="t" o:hr="t" fillcolor="#a0a0a0" stroked="f"/>
         </w:pict>
       </w:r>
     </w:p>
@@ -19757,7 +19732,7 @@
     <w:p>
       <w:r>
         <w:pict w14:anchorId="70525FEE">
-          <v:rect id="_x0000_i2171" style="width:0;height:1.5pt" o:hralign="center" o:hrstd="t" o:hr="t" fillcolor="#a0a0a0" stroked="f"/>
+          <v:rect id="_x0000_i1138" style="width:0;height:1.5pt" o:hralign="center" o:hrstd="t" o:hr="t" fillcolor="#a0a0a0" stroked="f"/>
         </w:pict>
       </w:r>
     </w:p>
@@ -19784,7 +19759,7 @@
     <w:p>
       <w:r>
         <w:pict w14:anchorId="23372700">
-          <v:rect id="_x0000_i2172" style="width:0;height:1.5pt" o:hralign="center" o:hrstd="t" o:hr="t" fillcolor="#a0a0a0" stroked="f"/>
+          <v:rect id="_x0000_i1139" style="width:0;height:1.5pt" o:hralign="center" o:hrstd="t" o:hr="t" fillcolor="#a0a0a0" stroked="f"/>
         </w:pict>
       </w:r>
     </w:p>
@@ -19811,7 +19786,7 @@
     <w:p>
       <w:r>
         <w:pict w14:anchorId="15DFE705">
-          <v:rect id="_x0000_i2173" style="width:0;height:1.5pt" o:hralign="center" o:hrstd="t" o:hr="t" fillcolor="#a0a0a0" stroked="f"/>
+          <v:rect id="_x0000_i1140" style="width:0;height:1.5pt" o:hralign="center" o:hrstd="t" o:hr="t" fillcolor="#a0a0a0" stroked="f"/>
         </w:pict>
       </w:r>
     </w:p>
@@ -20042,7 +20017,7 @@
     <w:p>
       <w:r>
         <w:pict w14:anchorId="49AE7140">
-          <v:rect id="_x0000_i2174" style="width:0;height:1.5pt" o:hralign="center" o:hrstd="t" o:hr="t" fillcolor="#a0a0a0" stroked="f"/>
+          <v:rect id="_x0000_i1141" style="width:0;height:1.5pt" o:hralign="center" o:hrstd="t" o:hr="t" fillcolor="#a0a0a0" stroked="f"/>
         </w:pict>
       </w:r>
     </w:p>
@@ -20063,7 +20038,6 @@
     </w:p>
     <w:p>
       <w:r>
-        <w:lastRenderedPageBreak/>
         <w:t>Quartiles</w:t>
       </w:r>
       <w:r>
@@ -20096,7 +20070,7 @@
     <w:p>
       <w:r>
         <w:pict w14:anchorId="443B7433">
-          <v:rect id="_x0000_i2175" style="width:0;height:1.5pt" o:hralign="center" o:hrstd="t" o:hr="t" fillcolor="#a0a0a0" stroked="f"/>
+          <v:rect id="_x0000_i1142" style="width:0;height:1.5pt" o:hralign="center" o:hrstd="t" o:hr="t" fillcolor="#a0a0a0" stroked="f"/>
         </w:pict>
       </w:r>
     </w:p>
@@ -20112,6 +20086,7 @@
           <w:b/>
           <w:bCs/>
         </w:rPr>
+        <w:lastRenderedPageBreak/>
         <w:t>8. Importance in Data Science</w:t>
       </w:r>
     </w:p>
@@ -20308,7 +20283,7 @@
     <w:p>
       <w:r>
         <w:pict w14:anchorId="37E59B19">
-          <v:rect id="_x0000_i2176" style="width:0;height:1.5pt" o:hralign="center" o:hrstd="t" o:hr="t" fillcolor="#a0a0a0" stroked="f"/>
+          <v:rect id="_x0000_i1143" style="width:0;height:1.5pt" o:hralign="center" o:hrstd="t" o:hr="t" fillcolor="#a0a0a0" stroked="f"/>
         </w:pict>
       </w:r>
     </w:p>
@@ -20547,7 +20522,7 @@
     <w:p>
       <w:r>
         <w:pict w14:anchorId="7E7BEE5D">
-          <v:rect id="_x0000_i2177" style="width:0;height:1.5pt" o:hralign="center" o:hrstd="t" o:hr="t" fillcolor="#a0a0a0" stroked="f"/>
+          <v:rect id="_x0000_i1144" style="width:0;height:1.5pt" o:hralign="center" o:hrstd="t" o:hr="t" fillcolor="#a0a0a0" stroked="f"/>
         </w:pict>
       </w:r>
     </w:p>
@@ -20716,9 +20691,8 @@
     </w:tbl>
     <w:p>
       <w:r>
-        <w:lastRenderedPageBreak/>
         <w:pict w14:anchorId="73744F48">
-          <v:rect id="_x0000_i2178" style="width:0;height:1.5pt" o:hralign="center" o:hrstd="t" o:hr="t" fillcolor="#a0a0a0" stroked="f"/>
+          <v:rect id="_x0000_i1145" style="width:0;height:1.5pt" o:hralign="center" o:hrstd="t" o:hr="t" fillcolor="#a0a0a0" stroked="f"/>
         </w:pict>
       </w:r>
     </w:p>
@@ -20760,7 +20734,7 @@
     <w:p>
       <w:r>
         <w:pict w14:anchorId="501273C4">
-          <v:rect id="_x0000_i2179" style="width:0;height:1.5pt" o:hralign="center" o:hrstd="t" o:hr="t" fillcolor="#a0a0a0" stroked="f"/>
+          <v:rect id="_x0000_i1146" style="width:0;height:1.5pt" o:hralign="center" o:hrstd="t" o:hr="t" fillcolor="#a0a0a0" stroked="f"/>
         </w:pict>
       </w:r>
     </w:p>
@@ -20804,6 +20778,7 @@
           <w:b/>
           <w:bCs/>
         </w:rPr>
+        <w:lastRenderedPageBreak/>
         <w:t xml:space="preserve">Where is the </w:t>
       </w:r>
       <w:proofErr w:type="spellStart"/>
@@ -20852,7 +20827,7 @@
     <w:p>
       <w:r>
         <w:pict w14:anchorId="6EF014B8">
-          <v:rect id="_x0000_i2180" style="width:0;height:1.5pt" o:hralign="center" o:hrstd="t" o:hr="t" fillcolor="#a0a0a0" stroked="f"/>
+          <v:rect id="_x0000_i1147" style="width:0;height:1.5pt" o:hralign="center" o:hrstd="t" o:hr="t" fillcolor="#a0a0a0" stroked="f"/>
         </w:pict>
       </w:r>
     </w:p>
@@ -20918,7 +20893,7 @@
     <w:p>
       <w:r>
         <w:pict w14:anchorId="0B57D3FA">
-          <v:rect id="_x0000_i2181" style="width:0;height:1.5pt" o:hralign="center" o:hrstd="t" o:hr="t" fillcolor="#a0a0a0" stroked="f"/>
+          <v:rect id="_x0000_i1148" style="width:0;height:1.5pt" o:hralign="center" o:hrstd="t" o:hr="t" fillcolor="#a0a0a0" stroked="f"/>
         </w:pict>
       </w:r>
     </w:p>
@@ -21088,7 +21063,7 @@
     <w:p>
       <w:r>
         <w:pict w14:anchorId="436BDE7C">
-          <v:rect id="_x0000_i2182" style="width:0;height:1.5pt" o:hralign="center" o:hrstd="t" o:hr="t" fillcolor="#a0a0a0" stroked="f"/>
+          <v:rect id="_x0000_i1149" style="width:0;height:1.5pt" o:hralign="center" o:hrstd="t" o:hr="t" fillcolor="#a0a0a0" stroked="f"/>
         </w:pict>
       </w:r>
     </w:p>
@@ -21283,7 +21258,7 @@
     <w:p>
       <w:r>
         <w:pict w14:anchorId="1C430B86">
-          <v:rect id="_x0000_i2183" style="width:0;height:1.5pt" o:hralign="center" o:hrstd="t" o:hr="t" fillcolor="#a0a0a0" stroked="f"/>
+          <v:rect id="_x0000_i1150" style="width:0;height:1.5pt" o:hralign="center" o:hrstd="t" o:hr="t" fillcolor="#a0a0a0" stroked="f"/>
         </w:pict>
       </w:r>
     </w:p>
@@ -21299,58 +21274,58 @@
           <w:b/>
           <w:bCs/>
         </w:rPr>
+        <w:t>Example</w:t>
+      </w:r>
+    </w:p>
+    <w:p>
+      <w:r>
+        <w:t>Dataset:</w:t>
+      </w:r>
+    </w:p>
+    <w:p>
+      <w:r>
+        <w:t>5, 10, 15, 20</w:t>
+      </w:r>
+    </w:p>
+    <w:p>
+      <w:r>
+        <w:t>Step 1: Sum values</w:t>
+      </w:r>
+    </w:p>
+    <w:p>
+      <w:r>
+        <w:t xml:space="preserve">5 + 10 + 15 + 20 = </w:t>
+      </w:r>
+      <w:r>
+        <w:rPr>
+          <w:b/>
+          <w:bCs/>
+        </w:rPr>
+        <w:t>50</w:t>
+      </w:r>
+    </w:p>
+    <w:p>
+      <w:r>
+        <w:t>Step 2: Divide by number of values</w:t>
+      </w:r>
+    </w:p>
+    <w:p>
+      <w:r>
+        <w:t xml:space="preserve">Mean = 50 / 4 = </w:t>
+      </w:r>
+      <w:r>
+        <w:rPr>
+          <w:b/>
+          <w:bCs/>
+        </w:rPr>
+        <w:t>12.5</w:t>
+      </w:r>
+    </w:p>
+    <w:p>
+      <w:r>
         <w:lastRenderedPageBreak/>
-        <w:t>Example</w:t>
-      </w:r>
-    </w:p>
-    <w:p>
-      <w:r>
-        <w:t>Dataset:</w:t>
-      </w:r>
-    </w:p>
-    <w:p>
-      <w:r>
-        <w:t>5, 10, 15, 20</w:t>
-      </w:r>
-    </w:p>
-    <w:p>
-      <w:r>
-        <w:t>Step 1: Sum values</w:t>
-      </w:r>
-    </w:p>
-    <w:p>
-      <w:r>
-        <w:t xml:space="preserve">5 + 10 + 15 + 20 = </w:t>
-      </w:r>
-      <w:r>
-        <w:rPr>
-          <w:b/>
-          <w:bCs/>
-        </w:rPr>
-        <w:t>50</w:t>
-      </w:r>
-    </w:p>
-    <w:p>
-      <w:r>
-        <w:t>Step 2: Divide by number of values</w:t>
-      </w:r>
-    </w:p>
-    <w:p>
-      <w:r>
-        <w:t xml:space="preserve">Mean = 50 / 4 = </w:t>
-      </w:r>
-      <w:r>
-        <w:rPr>
-          <w:b/>
-          <w:bCs/>
-        </w:rPr>
-        <w:t>12.5</w:t>
-      </w:r>
-    </w:p>
-    <w:p>
-      <w:r>
         <w:pict w14:anchorId="531DCA4D">
-          <v:rect id="_x0000_i2184" style="width:0;height:1.5pt" o:hralign="center" o:hrstd="t" o:hr="t" fillcolor="#a0a0a0" stroked="f"/>
+          <v:rect id="_x0000_i1151" style="width:0;height:1.5pt" o:hralign="center" o:hrstd="t" o:hr="t" fillcolor="#a0a0a0" stroked="f"/>
         </w:pict>
       </w:r>
     </w:p>
@@ -21520,7 +21495,7 @@
     <w:p>
       <w:r>
         <w:pict w14:anchorId="38E6D5C6">
-          <v:rect id="_x0000_i2185" style="width:0;height:1.5pt" o:hralign="center" o:hrstd="t" o:hr="t" fillcolor="#a0a0a0" stroked="f"/>
+          <v:rect id="_x0000_i1152" style="width:0;height:1.5pt" o:hralign="center" o:hrstd="t" o:hr="t" fillcolor="#a0a0a0" stroked="f"/>
         </w:pict>
       </w:r>
     </w:p>
@@ -21577,7 +21552,7 @@
     <w:p>
       <w:r>
         <w:pict w14:anchorId="0AA3D2B1">
-          <v:rect id="_x0000_i2186" style="width:0;height:1.5pt" o:hralign="center" o:hrstd="t" o:hr="t" fillcolor="#a0a0a0" stroked="f"/>
+          <v:rect id="_x0000_i1153" style="width:0;height:1.5pt" o:hralign="center" o:hrstd="t" o:hr="t" fillcolor="#a0a0a0" stroked="f"/>
         </w:pict>
       </w:r>
     </w:p>
@@ -21621,7 +21596,7 @@
     <w:p>
       <w:r>
         <w:pict w14:anchorId="49D687E6">
-          <v:rect id="_x0000_i2187" style="width:0;height:1.5pt" o:hralign="center" o:hrstd="t" o:hr="t" fillcolor="#a0a0a0" stroked="f"/>
+          <v:rect id="_x0000_i1154" style="width:0;height:1.5pt" o:hralign="center" o:hrstd="t" o:hr="t" fillcolor="#a0a0a0" stroked="f"/>
         </w:pict>
       </w:r>
     </w:p>
@@ -21665,7 +21640,7 @@
     <w:p>
       <w:r>
         <w:pict w14:anchorId="462853DA">
-          <v:rect id="_x0000_i2188" style="width:0;height:1.5pt" o:hralign="center" o:hrstd="t" o:hr="t" fillcolor="#a0a0a0" stroked="f"/>
+          <v:rect id="_x0000_i1155" style="width:0;height:1.5pt" o:hralign="center" o:hrstd="t" o:hr="t" fillcolor="#a0a0a0" stroked="f"/>
         </w:pict>
       </w:r>
     </w:p>
@@ -21709,7 +21684,7 @@
     <w:p>
       <w:r>
         <w:pict w14:anchorId="1425AF1C">
-          <v:rect id="_x0000_i2189" style="width:0;height:1.5pt" o:hralign="center" o:hrstd="t" o:hr="t" fillcolor="#a0a0a0" stroked="f"/>
+          <v:rect id="_x0000_i1156" style="width:0;height:1.5pt" o:hralign="center" o:hrstd="t" o:hr="t" fillcolor="#a0a0a0" stroked="f"/>
         </w:pict>
       </w:r>
     </w:p>
@@ -21725,7 +21700,6 @@
           <w:b/>
           <w:bCs/>
         </w:rPr>
-        <w:lastRenderedPageBreak/>
         <w:t>Advantages</w:t>
       </w:r>
     </w:p>
@@ -21855,7 +21829,7 @@
     <w:p>
       <w:r>
         <w:pict w14:anchorId="04BB81A5">
-          <v:rect id="_x0000_i2190" style="width:0;height:1.5pt" o:hralign="center" o:hrstd="t" o:hr="t" fillcolor="#a0a0a0" stroked="f"/>
+          <v:rect id="_x0000_i1157" style="width:0;height:1.5pt" o:hralign="center" o:hrstd="t" o:hr="t" fillcolor="#a0a0a0" stroked="f"/>
         </w:pict>
       </w:r>
     </w:p>
@@ -21871,6 +21845,7 @@
           <w:b/>
           <w:bCs/>
         </w:rPr>
+        <w:lastRenderedPageBreak/>
         <w:t>3. Mode</w:t>
       </w:r>
     </w:p>
@@ -21922,7 +21897,7 @@
     <w:p>
       <w:r>
         <w:pict w14:anchorId="28693A76">
-          <v:rect id="_x0000_i2191" style="width:0;height:1.5pt" o:hralign="center" o:hrstd="t" o:hr="t" fillcolor="#a0a0a0" stroked="f"/>
+          <v:rect id="_x0000_i1158" style="width:0;height:1.5pt" o:hralign="center" o:hrstd="t" o:hr="t" fillcolor="#a0a0a0" stroked="f"/>
         </w:pict>
       </w:r>
     </w:p>
@@ -21966,7 +21941,7 @@
     <w:p>
       <w:r>
         <w:pict w14:anchorId="67F47816">
-          <v:rect id="_x0000_i2192" style="width:0;height:1.5pt" o:hralign="center" o:hrstd="t" o:hr="t" fillcolor="#a0a0a0" stroked="f"/>
+          <v:rect id="_x0000_i1159" style="width:0;height:1.5pt" o:hralign="center" o:hrstd="t" o:hr="t" fillcolor="#a0a0a0" stroked="f"/>
         </w:pict>
       </w:r>
     </w:p>
@@ -22136,7 +22111,7 @@
     <w:p>
       <w:r>
         <w:pict w14:anchorId="28AFDF2D">
-          <v:rect id="_x0000_i2193" style="width:0;height:1.5pt" o:hralign="center" o:hrstd="t" o:hr="t" fillcolor="#a0a0a0" stroked="f"/>
+          <v:rect id="_x0000_i1160" style="width:0;height:1.5pt" o:hralign="center" o:hrstd="t" o:hr="t" fillcolor="#a0a0a0" stroked="f"/>
         </w:pict>
       </w:r>
     </w:p>
@@ -22180,7 +22155,7 @@
     <w:p>
       <w:r>
         <w:pict w14:anchorId="7E118C7F">
-          <v:rect id="_x0000_i2194" style="width:0;height:1.5pt" o:hralign="center" o:hrstd="t" o:hr="t" fillcolor="#a0a0a0" stroked="f"/>
+          <v:rect id="_x0000_i1161" style="width:0;height:1.5pt" o:hralign="center" o:hrstd="t" o:hr="t" fillcolor="#a0a0a0" stroked="f"/>
         </w:pict>
       </w:r>
     </w:p>
@@ -22326,7 +22301,6 @@
               <w:spacing w:after="160" w:line="259" w:lineRule="auto"/>
             </w:pPr>
             <w:r>
-              <w:lastRenderedPageBreak/>
               <w:t>Mode</w:t>
             </w:r>
           </w:p>
@@ -22351,7 +22325,7 @@
     <w:p>
       <w:r>
         <w:pict w14:anchorId="0247EB76">
-          <v:rect id="_x0000_i2195" style="width:0;height:1.5pt" o:hralign="center" o:hrstd="t" o:hr="t" fillcolor="#a0a0a0" stroked="f"/>
+          <v:rect id="_x0000_i1162" style="width:0;height:1.5pt" o:hralign="center" o:hrstd="t" o:hr="t" fillcolor="#a0a0a0" stroked="f"/>
         </w:pict>
       </w:r>
     </w:p>
@@ -22422,7 +22396,7 @@
     <w:p>
       <w:r>
         <w:pict w14:anchorId="1C20C325">
-          <v:rect id="_x0000_i2196" style="width:0;height:1.5pt" o:hralign="center" o:hrstd="t" o:hr="t" fillcolor="#a0a0a0" stroked="f"/>
+          <v:rect id="_x0000_i1163" style="width:0;height:1.5pt" o:hralign="center" o:hrstd="t" o:hr="t" fillcolor="#a0a0a0" stroked="f"/>
         </w:pict>
       </w:r>
     </w:p>
@@ -22488,6 +22462,7 @@
           <w:b/>
           <w:bCs/>
         </w:rPr>
+        <w:lastRenderedPageBreak/>
         <w:t>Formula</w:t>
       </w:r>
     </w:p>
@@ -22499,7 +22474,7 @@
     <w:p>
       <w:r>
         <w:pict w14:anchorId="2FEB1B8A">
-          <v:rect id="_x0000_i2197" style="width:0;height:1.5pt" o:hralign="center" o:hrstd="t" o:hr="t" fillcolor="#a0a0a0" stroked="f"/>
+          <v:rect id="_x0000_i1164" style="width:0;height:1.5pt" o:hralign="center" o:hrstd="t" o:hr="t" fillcolor="#a0a0a0" stroked="f"/>
         </w:pict>
       </w:r>
     </w:p>
@@ -22552,7 +22527,7 @@
     <w:p>
       <w:r>
         <w:pict w14:anchorId="698C5758">
-          <v:rect id="_x0000_i2198" style="width:0;height:1.5pt" o:hralign="center" o:hrstd="t" o:hr="t" fillcolor="#a0a0a0" stroked="f"/>
+          <v:rect id="_x0000_i1165" style="width:0;height:1.5pt" o:hralign="center" o:hrstd="t" o:hr="t" fillcolor="#a0a0a0" stroked="f"/>
         </w:pict>
       </w:r>
     </w:p>
@@ -22589,7 +22564,7 @@
     <w:p>
       <w:r>
         <w:pict w14:anchorId="47FFBF7B">
-          <v:rect id="_x0000_i2199" style="width:0;height:1.5pt" o:hralign="center" o:hrstd="t" o:hr="t" fillcolor="#a0a0a0" stroked="f"/>
+          <v:rect id="_x0000_i1166" style="width:0;height:1.5pt" o:hralign="center" o:hrstd="t" o:hr="t" fillcolor="#a0a0a0" stroked="f"/>
         </w:pict>
       </w:r>
     </w:p>
@@ -22655,7 +22630,7 @@
     <w:p>
       <w:r>
         <w:pict w14:anchorId="3961BCD5">
-          <v:rect id="_x0000_i2200" style="width:0;height:1.5pt" o:hralign="center" o:hrstd="t" o:hr="t" fillcolor="#a0a0a0" stroked="f"/>
+          <v:rect id="_x0000_i1167" style="width:0;height:1.5pt" o:hralign="center" o:hrstd="t" o:hr="t" fillcolor="#a0a0a0" stroked="f"/>
         </w:pict>
       </w:r>
     </w:p>
@@ -22744,7 +22719,6 @@
               <w:spacing w:after="160" w:line="259" w:lineRule="auto"/>
             </w:pPr>
             <w:r>
-              <w:lastRenderedPageBreak/>
               <w:t>Symbol</w:t>
             </w:r>
           </w:p>
@@ -22938,7 +22912,7 @@
     <w:p>
       <w:r>
         <w:pict w14:anchorId="75960779">
-          <v:rect id="_x0000_i2201" style="width:0;height:1.5pt" o:hralign="center" o:hrstd="t" o:hr="t" fillcolor="#a0a0a0" stroked="f"/>
+          <v:rect id="_x0000_i1168" style="width:0;height:1.5pt" o:hralign="center" o:hrstd="t" o:hr="t" fillcolor="#a0a0a0" stroked="f"/>
         </w:pict>
       </w:r>
     </w:p>
@@ -22959,6 +22933,7 @@
     </w:p>
     <w:p>
       <w:r>
+        <w:lastRenderedPageBreak/>
         <w:t>Dataset:</w:t>
       </w:r>
     </w:p>
@@ -23218,7 +23193,7 @@
     <w:p>
       <w:r>
         <w:pict w14:anchorId="17A9B3D5">
-          <v:rect id="_x0000_i2202" style="width:0;height:1.5pt" o:hralign="center" o:hrstd="t" o:hr="t" fillcolor="#a0a0a0" stroked="f"/>
+          <v:rect id="_x0000_i1169" style="width:0;height:1.5pt" o:hralign="center" o:hrstd="t" o:hr="t" fillcolor="#a0a0a0" stroked="f"/>
         </w:pict>
       </w:r>
     </w:p>
@@ -23290,7 +23265,7 @@
     <w:p>
       <w:r>
         <w:pict w14:anchorId="6464A40E">
-          <v:rect id="_x0000_i2203" style="width:0;height:1.5pt" o:hralign="center" o:hrstd="t" o:hr="t" fillcolor="#a0a0a0" stroked="f"/>
+          <v:rect id="_x0000_i1170" style="width:0;height:1.5pt" o:hralign="center" o:hrstd="t" o:hr="t" fillcolor="#a0a0a0" stroked="f"/>
         </w:pict>
       </w:r>
     </w:p>
@@ -23311,7 +23286,13 @@
     </w:p>
     <w:p>
       <w:r>
-        <w:t>Standard Deviation = √Variance</w:t>
+        <w:t>Standard Deviation = √</w:t>
+      </w:r>
+      <w:r>
+        <w:t xml:space="preserve"> </w:t>
+      </w:r>
+      <w:r>
+        <w:t>Variance</w:t>
       </w:r>
     </w:p>
     <w:p>
@@ -23435,7 +23416,7 @@
     <w:p>
       <w:r>
         <w:pict w14:anchorId="03F69757">
-          <v:rect id="_x0000_i2204" style="width:0;height:1.5pt" o:hralign="center" o:hrstd="t" o:hr="t" fillcolor="#a0a0a0" stroked="f"/>
+          <v:rect id="_x0000_i1171" style="width:0;height:1.5pt" o:hralign="center" o:hrstd="t" o:hr="t" fillcolor="#a0a0a0" stroked="f"/>
         </w:pict>
       </w:r>
     </w:p>
@@ -23451,7 +23432,6 @@
           <w:b/>
           <w:bCs/>
         </w:rPr>
-        <w:lastRenderedPageBreak/>
         <w:t>Example</w:t>
       </w:r>
     </w:p>
@@ -23467,13 +23447,19 @@
     </w:p>
     <w:p>
       <w:r>
-        <w:t>√2.67 ≈ 1.63</w:t>
+        <w:t>√</w:t>
+      </w:r>
+      <w:r>
+        <w:t xml:space="preserve"> </w:t>
+      </w:r>
+      <w:r>
+        <w:t>2.67 ≈ 1.63</w:t>
       </w:r>
     </w:p>
     <w:p>
       <w:r>
         <w:pict w14:anchorId="26188773">
-          <v:rect id="_x0000_i2205" style="width:0;height:1.5pt" o:hralign="center" o:hrstd="t" o:hr="t" fillcolor="#a0a0a0" stroked="f"/>
+          <v:rect id="_x0000_i1172" style="width:0;height:1.5pt" o:hralign="center" o:hrstd="t" o:hr="t" fillcolor="#a0a0a0" stroked="f"/>
         </w:pict>
       </w:r>
     </w:p>
@@ -23552,6 +23538,7 @@
               <w:spacing w:after="160" w:line="259" w:lineRule="auto"/>
             </w:pPr>
             <w:r>
+              <w:lastRenderedPageBreak/>
               <w:t>Low standard deviation</w:t>
             </w:r>
           </w:p>
@@ -23608,7 +23595,7 @@
     <w:p>
       <w:r>
         <w:pict w14:anchorId="16110C04">
-          <v:rect id="_x0000_i2206" style="width:0;height:1.5pt" o:hralign="center" o:hrstd="t" o:hr="t" fillcolor="#a0a0a0" stroked="f"/>
+          <v:rect id="_x0000_i1173" style="width:0;height:1.5pt" o:hralign="center" o:hrstd="t" o:hr="t" fillcolor="#a0a0a0" stroked="f"/>
         </w:pict>
       </w:r>
     </w:p>
@@ -23775,7 +23762,7 @@
     <w:p>
       <w:r>
         <w:pict w14:anchorId="2706A2A3">
-          <v:rect id="_x0000_i2207" style="width:0;height:1.5pt" o:hralign="center" o:hrstd="t" o:hr="t" fillcolor="#a0a0a0" stroked="f"/>
+          <v:rect id="_x0000_i1174" style="width:0;height:1.5pt" o:hralign="center" o:hrstd="t" o:hr="t" fillcolor="#a0a0a0" stroked="f"/>
         </w:pict>
       </w:r>
     </w:p>
@@ -23945,7 +23932,7 @@
     <w:p>
       <w:r>
         <w:pict w14:anchorId="449A0EFF">
-          <v:rect id="_x0000_i2208" style="width:0;height:1.5pt" o:hralign="center" o:hrstd="t" o:hr="t" fillcolor="#a0a0a0" stroked="f"/>
+          <v:rect id="_x0000_i1175" style="width:0;height:1.5pt" o:hralign="center" o:hrstd="t" o:hr="t" fillcolor="#a0a0a0" stroked="f"/>
         </w:pict>
       </w:r>
     </w:p>
@@ -24158,7 +24145,6 @@
               <w:spacing w:after="160" w:line="259" w:lineRule="auto"/>
             </w:pPr>
             <w:r>
-              <w:lastRenderedPageBreak/>
               <w:t>Variance</w:t>
             </w:r>
           </w:p>
@@ -24215,7 +24201,7 @@
     <w:p>
       <w:r>
         <w:pict w14:anchorId="653E26EC">
-          <v:rect id="_x0000_i2209" style="width:0;height:1.5pt" o:hralign="center" o:hrstd="t" o:hr="t" fillcolor="#a0a0a0" stroked="f"/>
+          <v:rect id="_x0000_i1176" style="width:0;height:1.5pt" o:hralign="center" o:hrstd="t" o:hr="t" fillcolor="#a0a0a0" stroked="f"/>
         </w:pict>
       </w:r>
     </w:p>
@@ -24265,6 +24251,7 @@
     </w:p>
     <w:p>
       <w:r>
+        <w:lastRenderedPageBreak/>
         <w:t xml:space="preserve">Together these measures help data scientists </w:t>
       </w:r>
       <w:r>
@@ -24281,7 +24268,7 @@
     <w:p>
       <w:r>
         <w:pict w14:anchorId="1C682738">
-          <v:rect id="_x0000_i2210" style="width:0;height:1.5pt" o:hralign="center" o:hrstd="t" o:hr="t" fillcolor="#a0a0a0" stroked="f"/>
+          <v:rect id="_x0000_i1177" style="width:0;height:1.5pt" o:hralign="center" o:hrstd="t" o:hr="t" fillcolor="#a0a0a0" stroked="f"/>
         </w:pict>
       </w:r>
     </w:p>
@@ -24531,7 +24518,7 @@
     <w:p>
       <w:r>
         <w:pict w14:anchorId="62B55001">
-          <v:rect id="_x0000_i2211" style="width:0;height:1.5pt" o:hralign="center" o:hrstd="t" o:hr="t" fillcolor="#a0a0a0" stroked="f"/>
+          <v:rect id="_x0000_i1178" style="width:0;height:1.5pt" o:hralign="center" o:hrstd="t" o:hr="t" fillcolor="#a0a0a0" stroked="f"/>
         </w:pict>
       </w:r>
     </w:p>
@@ -24611,8 +24598,18 @@
     </w:p>
     <w:p>
       <w:r>
+        <w:t>Mathematical Formula :</w:t>
+      </w:r>
+    </w:p>
+    <w:p>
+      <w:r>
+        <w:t xml:space="preserve"> skewness = (3 * (mean-median)) / standard deviation</w:t>
+      </w:r>
+    </w:p>
+    <w:p>
+      <w:r>
         <w:pict w14:anchorId="60CB2D33">
-          <v:rect id="_x0000_i2212" style="width:0;height:1.5pt" o:hralign="center" o:hrstd="t" o:hr="t" fillcolor="#a0a0a0" stroked="f"/>
+          <v:rect id="_x0000_i1179" style="width:0;height:1.5pt" o:hralign="center" o:hrstd="t" o:hr="t" fillcolor="#a0a0a0" stroked="f"/>
         </w:pict>
       </w:r>
     </w:p>
@@ -24706,7 +24703,6 @@
               <w:spacing w:after="160" w:line="259" w:lineRule="auto"/>
             </w:pPr>
             <w:r>
-              <w:lastRenderedPageBreak/>
               <w:t>Symmetrical Distribution</w:t>
             </w:r>
           </w:p>
@@ -24798,7 +24794,7 @@
     <w:p>
       <w:r>
         <w:pict w14:anchorId="6D91DA83">
-          <v:rect id="_x0000_i2213" style="width:0;height:1.5pt" o:hralign="center" o:hrstd="t" o:hr="t" fillcolor="#a0a0a0" stroked="f"/>
+          <v:rect id="_x0000_i1180" style="width:0;height:1.5pt" o:hralign="center" o:hrstd="t" o:hr="t" fillcolor="#a0a0a0" stroked="f"/>
         </w:pict>
       </w:r>
     </w:p>
@@ -24830,6 +24826,7 @@
         </w:numPr>
       </w:pPr>
       <w:r>
+        <w:lastRenderedPageBreak/>
         <w:t>left side and right side are equal</w:t>
       </w:r>
     </w:p>
@@ -24857,6 +24854,9 @@
         <w:t xml:space="preserve">   </w:t>
       </w:r>
       <w:r>
+        <w:t xml:space="preserve">   </w:t>
+      </w:r>
+      <w:r>
         <w:t>^</w:t>
       </w:r>
       <w:r>
@@ -24867,13 +24867,25 @@
         <w:tab/>
       </w:r>
       <w:r>
-        <w:t xml:space="preserve"> /</w:t>
-      </w:r>
-      <w:r>
         <w:t xml:space="preserve"> </w:t>
       </w:r>
       <w:r>
-        <w:t xml:space="preserve"> \</w:t>
+        <w:t xml:space="preserve">   </w:t>
+      </w:r>
+      <w:r>
+        <w:t>/</w:t>
+      </w:r>
+      <w:r>
+        <w:t xml:space="preserve"> </w:t>
+      </w:r>
+      <w:r>
+        <w:t xml:space="preserve"> </w:t>
+      </w:r>
+      <w:r>
+        <w:t xml:space="preserve"> </w:t>
+      </w:r>
+      <w:r>
+        <w:t>\</w:t>
       </w:r>
       <w:r>
         <w:br/>
@@ -24883,18 +24895,33 @@
         <w:tab/>
       </w:r>
       <w:r>
+        <w:t xml:space="preserve">  </w:t>
+      </w:r>
+      <w:r>
         <w:t xml:space="preserve">/ </w:t>
       </w:r>
       <w:r>
         <w:t xml:space="preserve"> </w:t>
       </w:r>
       <w:r>
-        <w:t xml:space="preserve">  \</w:t>
-      </w:r>
-    </w:p>
-    <w:p>
-      <w:r>
-        <w:t xml:space="preserve">             </w:t>
+        <w:t xml:space="preserve">  </w:t>
+      </w:r>
+      <w:r>
+        <w:t xml:space="preserve">   </w:t>
+      </w:r>
+      <w:r>
+        <w:t>\</w:t>
+      </w:r>
+    </w:p>
+    <w:p>
+      <w:r>
+        <w:t xml:space="preserve">         </w:t>
+      </w:r>
+      <w:r>
+        <w:t xml:space="preserve"> </w:t>
+      </w:r>
+      <w:r>
+        <w:t xml:space="preserve">    </w:t>
       </w:r>
       <w:r>
         <w:t xml:space="preserve">/ </w:t>
@@ -24909,7 +24936,13 @@
         <w:t xml:space="preserve"> </w:t>
       </w:r>
       <w:r>
-        <w:t xml:space="preserve">  \</w:t>
+        <w:t xml:space="preserve">  </w:t>
+      </w:r>
+      <w:r>
+        <w:t xml:space="preserve">     </w:t>
+      </w:r>
+      <w:r>
+        <w:t>\</w:t>
       </w:r>
     </w:p>
     <w:p>
@@ -24917,7 +24950,13 @@
         <w:t xml:space="preserve">        </w:t>
       </w:r>
       <w:r>
-        <w:t>---|-------|---</w:t>
+        <w:t>---|------</w:t>
+      </w:r>
+      <w:r>
+        <w:t>----</w:t>
+      </w:r>
+      <w:r>
+        <w:t>-|---</w:t>
       </w:r>
     </w:p>
     <w:p>
@@ -24953,7 +24992,7 @@
     <w:p>
       <w:r>
         <w:pict w14:anchorId="0F78BD64">
-          <v:rect id="_x0000_i2214" style="width:0;height:1.5pt" o:hralign="center" o:hrstd="t" o:hr="t" fillcolor="#a0a0a0" stroked="f"/>
+          <v:rect id="_x0000_i1181" style="width:0;height:1.5pt" o:hralign="center" o:hrstd="t" o:hr="t" fillcolor="#a0a0a0" stroked="f"/>
         </w:pict>
       </w:r>
     </w:p>
@@ -25164,7 +25203,51 @@
         <w:t xml:space="preserve">      </w:t>
       </w:r>
       <w:r>
-        <w:t xml:space="preserve">             </w:t>
+        <w:t xml:space="preserve">  </w:t>
+      </w:r>
+    </w:p>
+    <w:p>
+      <w:pPr>
+        <w:rPr>
+          <w:b/>
+          <w:bCs/>
+        </w:rPr>
+      </w:pPr>
+      <w:r>
+        <w:rPr>
+          <w:b/>
+          <w:bCs/>
+        </w:rPr>
+        <w:t>Mean &gt;</w:t>
+      </w:r>
+      <w:r>
+        <w:rPr>
+          <w:b/>
+          <w:bCs/>
+        </w:rPr>
+        <w:t xml:space="preserve"> </w:t>
+      </w:r>
+      <w:r>
+        <w:rPr>
+          <w:b/>
+          <w:bCs/>
+        </w:rPr>
+        <w:t>Median &gt; Mode</w:t>
+      </w:r>
+      <w:r>
+        <w:rPr>
+          <w:b/>
+          <w:bCs/>
+        </w:rPr>
+        <w:t xml:space="preserve">          </w:t>
+      </w:r>
+    </w:p>
+    <w:p>
+      <w:pPr>
+        <w:ind w:firstLine="720"/>
+      </w:pPr>
+      <w:r>
+        <w:t xml:space="preserve">     </w:t>
       </w:r>
       <w:r>
         <w:t>^</w:t>
@@ -25187,6 +25270,9 @@
         <w:t xml:space="preserve"> </w:t>
       </w:r>
       <w:r>
+        <w:t xml:space="preserve">  </w:t>
+      </w:r>
+      <w:r>
         <w:t>\</w:t>
       </w:r>
       <w:r>
@@ -25206,10 +25292,22 @@
         <w:t xml:space="preserve"> </w:t>
       </w:r>
       <w:r>
+        <w:t xml:space="preserve"> </w:t>
+      </w:r>
+      <w:r>
         <w:t xml:space="preserve">  </w:t>
       </w:r>
       <w:r>
-        <w:t xml:space="preserve"> \</w:t>
+        <w:t xml:space="preserve"> </w:t>
+      </w:r>
+      <w:r>
+        <w:t xml:space="preserve"> </w:t>
+      </w:r>
+      <w:r>
+        <w:t xml:space="preserve"> </w:t>
+      </w:r>
+      <w:r>
+        <w:t>\</w:t>
       </w:r>
       <w:r>
         <w:br/>
@@ -25225,7 +25323,16 @@
         <w:t xml:space="preserve">      </w:t>
       </w:r>
       <w:r>
-        <w:t xml:space="preserve">  \</w:t>
+        <w:t xml:space="preserve">  </w:t>
+      </w:r>
+      <w:r>
+        <w:t xml:space="preserve">  </w:t>
+      </w:r>
+      <w:r>
+        <w:t xml:space="preserve"> </w:t>
+      </w:r>
+      <w:r>
+        <w:t>\</w:t>
       </w:r>
       <w:r>
         <w:br/>
@@ -25240,12 +25347,17 @@
         <w:t>---</w:t>
       </w:r>
       <w:r>
-        <w:t>---|-----&gt;</w:t>
-      </w:r>
-    </w:p>
-    <w:p>
-      <w:r>
-        <w:lastRenderedPageBreak/>
+        <w:t>--</w:t>
+      </w:r>
+      <w:r>
+        <w:t>---</w:t>
+      </w:r>
+      <w:r>
+        <w:t>-|-----&gt;</w:t>
+      </w:r>
+    </w:p>
+    <w:p>
+      <w:r>
         <w:t>Example dataset:</w:t>
       </w:r>
     </w:p>
@@ -25274,10 +25386,11 @@
         <w:t>Mean becomes larger than median.</w:t>
       </w:r>
     </w:p>
+    <w:p/>
     <w:p>
       <w:r>
         <w:pict w14:anchorId="26066B17">
-          <v:rect id="_x0000_i2215" style="width:0;height:1.5pt" o:hralign="center" o:hrstd="t" o:hr="t" fillcolor="#a0a0a0" stroked="f"/>
+          <v:rect id="_x0000_i1182" style="width:0;height:1.5pt" o:hralign="center" o:hrstd="t" o:hr="t" fillcolor="#a0a0a0" stroked="f"/>
         </w:pict>
       </w:r>
     </w:p>
@@ -25329,7 +25442,7 @@
     <w:p>
       <w:r>
         <w:pict w14:anchorId="5F4708F3">
-          <v:rect id="_x0000_i2216" style="width:0;height:1.5pt" o:hralign="center" o:hrstd="t" o:hr="t" fillcolor="#a0a0a0" stroked="f"/>
+          <v:rect id="_x0000_i1183" style="width:0;height:1.5pt" o:hralign="center" o:hrstd="t" o:hr="t" fillcolor="#a0a0a0" stroked="f"/>
         </w:pict>
       </w:r>
     </w:p>
@@ -25608,6 +25721,21 @@
       </w:r>
     </w:p>
     <w:p>
+      <w:pPr>
+        <w:rPr>
+          <w:b/>
+          <w:bCs/>
+        </w:rPr>
+      </w:pPr>
+      <w:r>
+        <w:rPr>
+          <w:b/>
+          <w:bCs/>
+        </w:rPr>
+        <w:t>Mean &lt; median &lt; mode</w:t>
+      </w:r>
+    </w:p>
+    <w:p>
       <w:r>
         <w:t>Mean becomes smaller than median.</w:t>
       </w:r>
@@ -25615,7 +25743,7 @@
     <w:p>
       <w:r>
         <w:pict w14:anchorId="432F49F0">
-          <v:rect id="_x0000_i2217" style="width:0;height:1.5pt" o:hralign="center" o:hrstd="t" o:hr="t" fillcolor="#a0a0a0" stroked="f"/>
+          <v:rect id="_x0000_i1184" style="width:0;height:1.5pt" o:hralign="center" o:hrstd="t" o:hr="t" fillcolor="#a0a0a0" stroked="f"/>
         </w:pict>
       </w:r>
     </w:p>
@@ -25807,7 +25935,6 @@
               <w:spacing w:after="160" w:line="259" w:lineRule="auto"/>
             </w:pPr>
             <w:r>
-              <w:lastRenderedPageBreak/>
               <w:t>Negative Skew</w:t>
             </w:r>
           </w:p>
@@ -25847,7 +25974,7 @@
     <w:p>
       <w:r>
         <w:pict w14:anchorId="0834591A">
-          <v:rect id="_x0000_i2218" style="width:0;height:1.5pt" o:hralign="center" o:hrstd="t" o:hr="t" fillcolor="#a0a0a0" stroked="f"/>
+          <v:rect id="_x0000_i1185" style="width:0;height:1.5pt" o:hralign="center" o:hrstd="t" o:hr="t" fillcolor="#a0a0a0" stroked="f"/>
         </w:pict>
       </w:r>
     </w:p>
@@ -25863,6 +25990,7 @@
           <w:b/>
           <w:bCs/>
         </w:rPr>
+        <w:lastRenderedPageBreak/>
         <w:t>2. Kurtosis</w:t>
       </w:r>
     </w:p>
@@ -25941,7 +26069,7 @@
     <w:p>
       <w:r>
         <w:pict w14:anchorId="5B4AF6E9">
-          <v:rect id="_x0000_i2219" style="width:0;height:1.5pt" o:hralign="center" o:hrstd="t" o:hr="t" fillcolor="#a0a0a0" stroked="f"/>
+          <v:rect id="_x0000_i1186" style="width:0;height:1.5pt" o:hralign="center" o:hrstd="t" o:hr="t" fillcolor="#a0a0a0" stroked="f"/>
         </w:pict>
       </w:r>
     </w:p>
@@ -25957,17 +26085,8 @@
           <w:b/>
           <w:bCs/>
         </w:rPr>
-        <w:t xml:space="preserve">Types of </w:t>
-      </w:r>
-      <w:proofErr w:type="gramStart"/>
-      <w:r>
-        <w:rPr>
-          <w:b/>
-          <w:bCs/>
-        </w:rPr>
-        <w:t>Kurtosis</w:t>
-      </w:r>
-      <w:proofErr w:type="gramEnd"/>
+        <w:t>Types of Kurtosis</w:t>
+      </w:r>
     </w:p>
     <w:p>
       <w:r>
@@ -25978,17 +26097,8 @@
           <w:b/>
           <w:bCs/>
         </w:rPr>
-        <w:t xml:space="preserve">three types of </w:t>
-      </w:r>
-      <w:proofErr w:type="gramStart"/>
-      <w:r>
-        <w:rPr>
-          <w:b/>
-          <w:bCs/>
-        </w:rPr>
-        <w:t>kurtosis</w:t>
-      </w:r>
-      <w:proofErr w:type="gramEnd"/>
+        <w:t>three types of kurtosis</w:t>
+      </w:r>
       <w:r>
         <w:t>.</w:t>
       </w:r>
@@ -26144,7 +26254,7 @@
     <w:p>
       <w:r>
         <w:pict w14:anchorId="65EF38E3">
-          <v:rect id="_x0000_i2220" style="width:0;height:1.5pt" o:hralign="center" o:hrstd="t" o:hr="t" fillcolor="#a0a0a0" stroked="f"/>
+          <v:rect id="_x0000_i1187" style="width:0;height:1.5pt" o:hralign="center" o:hrstd="t" o:hr="t" fillcolor="#a0a0a0" stroked="f"/>
         </w:pict>
       </w:r>
     </w:p>
@@ -26290,7 +26400,7 @@
     <w:p>
       <w:r>
         <w:pict w14:anchorId="25663A0D">
-          <v:rect id="_x0000_i2221" style="width:0;height:1.5pt" o:hralign="center" o:hrstd="t" o:hr="t" fillcolor="#a0a0a0" stroked="f"/>
+          <v:rect id="_x0000_i1188" style="width:0;height:1.5pt" o:hralign="center" o:hrstd="t" o:hr="t" fillcolor="#a0a0a0" stroked="f"/>
         </w:pict>
       </w:r>
     </w:p>
@@ -26360,7 +26470,6 @@
     </w:p>
     <w:p>
       <w:r>
-        <w:lastRenderedPageBreak/>
         <w:t xml:space="preserve">       </w:t>
       </w:r>
       <w:r>
@@ -26421,6 +26530,9 @@
       </w:r>
       <w:r>
         <w:br/>
+      </w:r>
+      <w:r>
+        <w:lastRenderedPageBreak/>
         <w:t xml:space="preserve"> </w:t>
       </w:r>
       <w:r>
@@ -26501,7 +26613,7 @@
     <w:p>
       <w:r>
         <w:pict w14:anchorId="5DCDD98A">
-          <v:rect id="_x0000_i2222" style="width:0;height:1.5pt" o:hralign="center" o:hrstd="t" o:hr="t" fillcolor="#a0a0a0" stroked="f"/>
+          <v:rect id="_x0000_i1189" style="width:0;height:1.5pt" o:hralign="center" o:hrstd="t" o:hr="t" fillcolor="#a0a0a0" stroked="f"/>
         </w:pict>
       </w:r>
     </w:p>
@@ -26670,7 +26782,7 @@
     <w:p>
       <w:r>
         <w:pict w14:anchorId="3D1F74A6">
-          <v:rect id="_x0000_i2223" style="width:0;height:1.5pt" o:hralign="center" o:hrstd="t" o:hr="t" fillcolor="#a0a0a0" stroked="f"/>
+          <v:rect id="_x0000_i1190" style="width:0;height:1.5pt" o:hralign="center" o:hrstd="t" o:hr="t" fillcolor="#a0a0a0" stroked="f"/>
         </w:pict>
       </w:r>
     </w:p>
@@ -26745,7 +26857,7 @@
     <w:p>
       <w:r>
         <w:pict w14:anchorId="7ACAE542">
-          <v:rect id="_x0000_i2224" style="width:0;height:1.5pt" o:hralign="center" o:hrstd="t" o:hr="t" fillcolor="#a0a0a0" stroked="f"/>
+          <v:rect id="_x0000_i1191" style="width:0;height:1.5pt" o:hralign="center" o:hrstd="t" o:hr="t" fillcolor="#a0a0a0" stroked="f"/>
         </w:pict>
       </w:r>
     </w:p>
@@ -26791,7 +26903,6 @@
               <w:spacing w:after="160" w:line="259" w:lineRule="auto"/>
             </w:pPr>
             <w:r>
-              <w:lastRenderedPageBreak/>
               <w:t>Type</w:t>
             </w:r>
           </w:p>
@@ -26857,6 +26968,7 @@
               <w:spacing w:after="160" w:line="259" w:lineRule="auto"/>
             </w:pPr>
             <w:r>
+              <w:lastRenderedPageBreak/>
               <w:t>Mesokurtic</w:t>
             </w:r>
           </w:p>
@@ -27038,7 +27150,7 @@
     <w:p>
       <w:r>
         <w:pict w14:anchorId="54CA16D4">
-          <v:rect id="_x0000_i2225" style="width:0;height:1.5pt" o:hralign="center" o:hrstd="t" o:hr="t" fillcolor="#a0a0a0" stroked="f"/>
+          <v:rect id="_x0000_i1192" style="width:0;height:1.5pt" o:hralign="center" o:hrstd="t" o:hr="t" fillcolor="#a0a0a0" stroked="f"/>
         </w:pict>
       </w:r>
     </w:p>
@@ -27260,7 +27372,7 @@
     <w:p>
       <w:r>
         <w:pict w14:anchorId="67DA949C">
-          <v:rect id="_x0000_i2226" style="width:0;height:1.5pt" o:hralign="center" o:hrstd="t" o:hr="t" fillcolor="#a0a0a0" stroked="f"/>
+          <v:rect id="_x0000_i1193" style="width:0;height:1.5pt" o:hralign="center" o:hrstd="t" o:hr="t" fillcolor="#a0a0a0" stroked="f"/>
         </w:pict>
       </w:r>
     </w:p>
@@ -27400,7 +27512,7 @@
     <w:p>
       <w:r>
         <w:pict w14:anchorId="47841D75">
-          <v:rect id="_x0000_i2227" style="width:0;height:1.5pt" o:hralign="center" o:hrstd="t" o:hr="t" fillcolor="#a0a0a0" stroked="f"/>
+          <v:rect id="_x0000_i1194" style="width:0;height:1.5pt" o:hralign="center" o:hrstd="t" o:hr="t" fillcolor="#a0a0a0" stroked="f"/>
         </w:pict>
       </w:r>
     </w:p>
@@ -27446,7 +27558,7 @@
     <w:p>
       <w:r>
         <w:pict w14:anchorId="326AE3DA">
-          <v:rect id="_x0000_i2228" style="width:0;height:1.5pt" o:hralign="center" o:hrstd="t" o:hr="t" fillcolor="#a0a0a0" stroked="f"/>
+          <v:rect id="_x0000_i1195" style="width:0;height:1.5pt" o:hralign="center" o:hrstd="t" o:hr="t" fillcolor="#a0a0a0" stroked="f"/>
         </w:pict>
       </w:r>
     </w:p>
@@ -33734,6 +33846,7 @@
   <w:style w:type="character" w:default="1" w:styleId="DefaultParagraphFont">
     <w:name w:val="Default Paragraph Font"/>
     <w:uiPriority w:val="1"/>
+    <w:semiHidden/>
     <w:unhideWhenUsed/>
   </w:style>
   <w:style w:type="table" w:default="1" w:styleId="TableNormal">

</xml_diff>